<commit_message>
Scoping doc 4.1: explain why the window ends at 2023/24
Tracked changes (author "Claude") for review in Word:
- heading now covers the end of the window as well as the start
- corrects the data provider from StatsBomb to Opta (Stats Perform)
- new paragraphs: the 20 January 2026 Opta termination and removal of
  FBref's advanced stats, this project's own confirmation from the raw
  pages, and why the frozen worldfootballR snapshot sets 2023/24 as the
  last complete season
- sources: the Sports-Reference announcement and The IX (4 Feb 2026)
- decision line: seven seasons instead of nine

Rejecting every change restores the original text exactly. Other
sections still say nine seasons and are left for a separate pass.

Co-Authored-By: Claude Opus 5 <noreply@anthropic.com>
</commit_message>
<xml_diff>
--- a/docs/Transfer-Market-Efficiency-Scoping-Doc.docx
+++ b/docs/Transfer-Market-Efficiency-Scoping-Doc.docx
@@ -970,17 +970,48 @@
       <w:r>
         <w:t xml:space="preserve">4.1  Why the window starts at 2017/18</w:t>
       </w:r>
-    </w:p>
-    <w:p>
-      <w:pPr>
-        <w:spacing w:after="140"/>
-      </w:pPr>
-      <w:r>
-        <w:rPr>
-          <w:sz w:val="22"/>
-          <w:szCs w:val="22"/>
-        </w:rPr>
-        <w:t xml:space="preserve">FBref's advanced statistics are supplied by StatsBomb and begin with the 2017/18 big-five season. Before that, the available data is goals, assists, minutes and cards — nothing more.</w:t>
+      <w:ins w:id="9001" w:author="Claude" w:date="2026-09-11T21:00:07Z">
+        <w:r>
+          <w:rPr/>
+          <w:t xml:space="preserve"> and ends at 2023/24</w:t>
+        </w:r>
+      </w:ins>
+    </w:p>
+    <w:p>
+      <w:pPr>
+        <w:spacing w:after="140"/>
+      </w:pPr>
+      <w:r>
+        <w:rPr>
+          <w:sz w:val="22"/>
+          <w:szCs w:val="22"/>
+        </w:rPr>
+        <w:t xml:space="preserve">FBref's advanced statistics </w:t>
+      </w:r>
+      <w:del w:id="9002" w:author="Claude" w:date="2026-09-11T21:00:07Z">
+        <w:r>
+          <w:rPr>
+            <w:sz w:val="22"/>
+            <w:szCs w:val="22"/>
+          </w:rPr>
+          <w:delText xml:space="preserve">are supplied by StatsBomb</w:delText>
+        </w:r>
+      </w:del>
+      <w:ins w:id="9003" w:author="Claude" w:date="2026-09-11T21:00:07Z">
+        <w:r>
+          <w:rPr>
+            <w:sz w:val="22"/>
+            <w:szCs w:val="22"/>
+          </w:rPr>
+          <w:t xml:space="preserve">were supplied by Opta (Stats Perform)</w:t>
+        </w:r>
+      </w:ins>
+      <w:r>
+        <w:rPr>
+          <w:sz w:val="22"/>
+          <w:szCs w:val="22"/>
+        </w:rPr>
+        <w:t xml:space="preserve"> and begin with the 2017/18 big-five season. Before that, the available data is goals, assists, minutes and cards — nothing more.</w:t>
       </w:r>
     </w:p>
     <w:p>
@@ -1006,6 +1037,83 @@
         </w:rPr>
         <w:t xml:space="preserve">Understat offers xG back to 2014/15 and was considered. It was rejected because it is shot-based only: it would have improved coverage for forwards while leaving defenders just as poorly measured. That buys three extra years at the direct cost of the project's central methodological idea.</w:t>
       </w:r>
+    </w:p>
+    <w:p>
+      <w:pPr>
+        <w:spacing w:after="140"/>
+        <w:rPr>
+          <w:ins w:id="9004" w:author="Claude" w:date="2026-09-11T21:00:07Z"/>
+        </w:rPr>
+      </w:pPr>
+      <w:ins w:id="9005" w:author="Claude" w:date="2026-09-11T21:00:07Z">
+        <w:r>
+          <w:rPr>
+            <w:b/>
+            <w:bCs/>
+            <w:sz w:val="22"/>
+            <w:szCs w:val="22"/>
+          </w:rPr>
+          <w:t xml:space="preserve">Why the window ends at 2023/24. </w:t>
+        </w:r>
+        <w:r>
+          <w:rPr>
+            <w:sz w:val="22"/>
+            <w:szCs w:val="22"/>
+          </w:rPr>
+          <w:t xml:space="preserve">On 20 January 2026, Opta (Stats Perform) terminated FBref's access to its data, citing a breach of their agreement, and Sports Reference removed every Opta-sourced advanced statistic from FBref: xG and xAG, progressive passes and carries, advanced defensive actions, and shot- and goal-creating actions. The removal covers past seasons as well as new ones. Basic statistics such as minutes, goals, assists and cards remain [1][2].</w:t>
+        </w:r>
+      </w:ins>
+    </w:p>
+    <w:p>
+      <w:pPr>
+        <w:spacing w:after="140"/>
+        <w:rPr>
+          <w:ins w:id="9006" w:author="Claude" w:date="2026-09-11T21:00:07Z"/>
+        </w:rPr>
+      </w:pPr>
+      <w:ins w:id="9007" w:author="Claude" w:date="2026-09-11T21:00:07Z">
+        <w:r>
+          <w:rPr>
+            <w:sz w:val="22"/>
+            <w:szCs w:val="22"/>
+          </w:rPr>
+          <w:t xml:space="preserve">This project confirmed the removal directly. FBref's 2023/24 Big 5 player pages, fetched in September 2026, still list every player, but each advanced column is either blank for every player or gone from the table (docs/phase-1-scraper-diagnostics.md in the repository).</w:t>
+        </w:r>
+      </w:ins>
+    </w:p>
+    <w:p>
+      <w:pPr>
+        <w:spacing w:after="140"/>
+        <w:rPr>
+          <w:ins w:id="9008" w:author="Claude" w:date="2026-09-11T21:00:07Z"/>
+        </w:rPr>
+      </w:pPr>
+      <w:ins w:id="9009" w:author="Claude" w:date="2026-09-11T21:00:07Z">
+        <w:r>
+          <w:rPr>
+            <w:sz w:val="22"/>
+            <w:szCs w:val="22"/>
+          </w:rPr>
+          <w:t xml:space="preserve">The last complete public copy of the Opta-era data is the worldfootballR data repository, archived on 18 September 2025, four months before the removal. Its defensive, possession, aerial-duel and goalkeeping tables are complete through 2023/24 but hold only nine matchweeks of 2024/25. Scoring 2024/25 from part of a season would break the consistency this section is built on, so the scored window ends at 2023/24. Transfer activity after that is still shown on the club page, unscored (see 4.8).</w:t>
+        </w:r>
+      </w:ins>
+    </w:p>
+    <w:p>
+      <w:pPr>
+        <w:spacing w:after="140"/>
+        <w:rPr>
+          <w:ins w:id="9010" w:author="Claude" w:date="2026-09-11T21:00:07Z"/>
+        </w:rPr>
+      </w:pPr>
+      <w:ins w:id="9011" w:author="Claude" w:date="2026-09-11T21:00:07Z">
+        <w:r>
+          <w:rPr>
+            <w:sz w:val="22"/>
+            <w:szCs w:val="22"/>
+          </w:rPr>
+          <w:t xml:space="preserve">Sources: [1] Sports Reference, "FBref &amp; Stathead Data Update", Sports-Reference.com blog, January 2026, https://www.sports-reference.com/blog/2026/01/fbref-stathead-data-update/. [2] Catalina Bush, "FBref's loss of advanced stats is a blow to women's soccer data accessibility", The IX, 4 February 2026, https://www.theixsports.com/the-ix-soccer/fbrefs-loss-advanced-stats-womens-soccer-data-accessibility/.</w:t>
+        </w:r>
+      </w:ins>
     </w:p>
     <w:p>
       <w:pPr>
@@ -1022,6 +1130,32 @@
         </w:rPr>
         <w:t xml:space="preserve">Decision: </w:t>
       </w:r>
+      <w:del w:id="9012" w:author="Claude" w:date="2026-09-11T21:00:07Z">
+        <w:r>
+          <w:rPr>
+            <w:b w:val="false"/>
+            <w:bCs w:val="false"/>
+            <w:i w:val="false"/>
+            <w:iCs w:val="false"/>
+            <w:sz w:val="22"/>
+            <w:szCs w:val="22"/>
+          </w:rPr>
+          <w:delText xml:space="preserve">start at 2017/18. Nine seasons</w:delText>
+        </w:r>
+      </w:del>
+      <w:ins w:id="9013" w:author="Claude" w:date="2026-09-11T21:00:07Z">
+        <w:r>
+          <w:rPr>
+            <w:b w:val="false"/>
+            <w:bCs w:val="false"/>
+            <w:i w:val="false"/>
+            <w:iCs w:val="false"/>
+            <w:sz w:val="22"/>
+            <w:szCs w:val="22"/>
+          </w:rPr>
+          <w:t xml:space="preserve">start at 2017/18, end at 2023/24. Seven seasons</w:t>
+        </w:r>
+      </w:ins>
       <w:r>
         <w:rPr>
           <w:b w:val="false"/>
@@ -1031,7 +1165,7 @@
           <w:sz w:val="22"/>
           <w:szCs w:val="22"/>
         </w:rPr>
-        <w:t xml:space="preserve">start at 2017/18. Nine seasons, one consistent data standard, no asterisk.</w:t>
+        <w:t xml:space="preserve">, one consistent data standard, no asterisk.</w:t>
       </w:r>
     </w:p>
     <w:p>

</xml_diff>

<commit_message>
Scoping doc 4.1: note advanced data may return at a smaller scale
Tyler read the Sports-Reference announcement directly (Sean Forman,
20 January 2026). Updates to the tracked changes in 4.1:
- Opta cited an unspecified breach and demanded immediate deletion;
  Sports Reference complied
- Sports Reference says some advanced data may return "at a dramatically
  smaller scale", so 4.1 now describes the gap as current rather than
  necessarily permanent, with any returning data needing to match the
  snapshot before use
- citation [1] now names the author and exact date

Still all tracked changes under "Claude"; rejecting them restores the
original text.

Co-Authored-By: Claude Opus 5 <noreply@anthropic.com>
</commit_message>
<xml_diff>
--- a/docs/Transfer-Market-Efficiency-Scoping-Doc.docx
+++ b/docs/Transfer-Market-Efficiency-Scoping-Doc.docx
@@ -1060,7 +1060,7 @@
             <w:sz w:val="22"/>
             <w:szCs w:val="22"/>
           </w:rPr>
-          <w:t xml:space="preserve">On 20 January 2026, Opta (Stats Perform) terminated FBref's access to its data, citing a breach of their agreement, and Sports Reference removed every Opta-sourced advanced statistic from FBref: xG and xAG, progressive passes and carries, advanced defensive actions, and shot- and goal-creating actions. The removal covers past seasons as well as new ones. Basic statistics such as minutes, goals, assists and cards remain [1][2].</w:t>
+          <w:t xml:space="preserve">On 20 January 2026, Opta (Stats Perform) terminated FBref's access to its data, citing an unspecified breach of their agreement, and demanded the data's immediate deletion. Sports Reference complied, removing every Opta-sourced advanced statistic from FBref: xG and xAG, progressive passes and carries, advanced defensive actions, and shot- and goal-creating actions. The removal covers past seasons as well as new ones. Basic statistics such as minutes, goals, assists and cards remain [1][2]. Sports Reference has said some advanced data may return in future, but "at a dramatically smaller scale" [1]. The gap is therefore current rather than necessarily permanent, and any data that does return would need to match the snapshot described below before this project used it.</w:t>
         </w:r>
       </w:ins>
     </w:p>
@@ -1111,7 +1111,7 @@
             <w:sz w:val="22"/>
             <w:szCs w:val="22"/>
           </w:rPr>
-          <w:t xml:space="preserve">Sources: [1] Sports Reference, "FBref &amp; Stathead Data Update", Sports-Reference.com blog, January 2026, https://www.sports-reference.com/blog/2026/01/fbref-stathead-data-update/. [2] Catalina Bush, "FBref's loss of advanced stats is a blow to women's soccer data accessibility", The IX, 4 February 2026, https://www.theixsports.com/the-ix-soccer/fbrefs-loss-advanced-stats-womens-soccer-data-accessibility/.</w:t>
+          <w:t xml:space="preserve">Sources: [1] Sean Forman (President, Sports Reference), "FBref &amp; Stathead Data Update", Sports-Reference.com blog, 20 January 2026, https://www.sports-reference.com/blog/2026/01/fbref-stathead-data-update/. [2] Catalina Bush, "FBref's loss of advanced stats is a blow to women's soccer data accessibility", The IX, 4 February 2026, https://www.theixsports.com/the-ix-soccer/fbrefs-loss-advanced-stats-womens-soccer-data-accessibility/.</w:t>
         </w:r>
       </w:ins>
     </w:p>

</xml_diff>

<commit_message>
Scoping doc: make every section consistent with the seven-season window
Tracked changes (author "Claude") in sections 1, 3, 4.2, 4.3, 4.7, 4.9,
5 and 7. 4.7 wasn't on the original list of sections; it's the same
one-word fix and can be rejected in Word.
- nine seasons/years becomes seven throughout; Newcastle's second date
  and the season-filter example now fall inside 2017/18-2023/24
- scope table: seasons to 2023/24, 145 clubs across the window, and
  the exclusions reworded
- 4.2 keeps the history: nine seasons was the first choice, and the
  loss of FBref's advanced data fixed it at seven
- risks: the scraper-fragility row is rewritten (it materialised and
  was superseded); club matching now names the team-ID rule, with the
  M'Gladbach/Gladbach evidence

Rejecting every change restores the original text exactly. Section 4.8
still describes only the 2026/27 window and is left for Tyler.

Co-Authored-By: Claude Opus 5 <noreply@anthropic.com>
</commit_message>
<xml_diff>
--- a/docs/Transfer-Market-Efficiency-Scoping-Doc.docx
+++ b/docs/Transfer-Market-Efficiency-Scoping-Doc.docx
@@ -372,7 +372,38 @@
           <w:sz w:val="22"/>
           <w:szCs w:val="22"/>
         </w:rPr>
-        <w:t xml:space="preserve">Which clubs in Europe's top five leagues extract the most on-field value per euro spent in the transfer market, which burn the most money for the least return, and — over nine seasons — which clubs actually got smarter?</w:t>
+        <w:t xml:space="preserve">Which clubs in Europe's top five leagues extract the most on-field value per euro spent in the transfer market, which burn the most money for the least return, and — </w:t>
+      </w:r>
+      <w:del w:id="9014" w:author="Claude" w:date="2026-09-11T21:20:49Z">
+        <w:r>
+          <w:rPr>
+            <w:i/>
+            <w:iCs/>
+            <w:sz w:val="22"/>
+            <w:szCs w:val="22"/>
+          </w:rPr>
+          <w:delText xml:space="preserve">over nine seasons</w:delText>
+        </w:r>
+      </w:del>
+      <w:ins w:id="9015" w:author="Claude" w:date="2026-09-11T21:20:49Z">
+        <w:r>
+          <w:rPr>
+            <w:i/>
+            <w:iCs/>
+            <w:sz w:val="22"/>
+            <w:szCs w:val="22"/>
+          </w:rPr>
+          <w:t xml:space="preserve">over seven seasons</w:t>
+        </w:r>
+      </w:ins>
+      <w:r>
+        <w:rPr>
+          <w:i/>
+          <w:iCs/>
+          <w:sz w:val="22"/>
+          <w:szCs w:val="22"/>
+        </w:rPr>
+        <w:t xml:space="preserve"> — which clubs actually got smarter?</w:t>
       </w:r>
     </w:p>
     <w:p>
@@ -739,8 +770,30 @@
                 <w:sz w:val="20"/>
                 <w:szCs w:val="20"/>
               </w:rPr>
-              <w:t xml:space="preserve">2017/18 – 2025/26 (nine complete seasons)</w:t>
-            </w:r>
+              <w:t xml:space="preserve">2017/18 – </w:t>
+            </w:r>
+            <w:del w:id="9016" w:author="Claude" w:date="2026-09-11T21:20:49Z">
+              <w:r>
+                <w:rPr>
+                  <w:b w:val="false"/>
+                  <w:bCs w:val="false"/>
+                  <w:sz w:val="20"/>
+                  <w:szCs w:val="20"/>
+                </w:rPr>
+                <w:delText xml:space="preserve">2025/26 (nine complete seasons)</w:delText>
+              </w:r>
+            </w:del>
+            <w:ins w:id="9017" w:author="Claude" w:date="2026-09-11T21:20:49Z">
+              <w:r>
+                <w:rPr>
+                  <w:b w:val="false"/>
+                  <w:bCs w:val="false"/>
+                  <w:sz w:val="20"/>
+                  <w:szCs w:val="20"/>
+                </w:rPr>
+                <w:t xml:space="preserve">2023/24 (seven complete seasons; see 4.1)</w:t>
+              </w:r>
+            </w:ins>
           </w:p>
         </w:tc>
       </w:tr>
@@ -781,14 +834,36 @@
             </w:tcMar>
           </w:tcPr>
           <w:p>
-            <w:r>
-              <w:rPr>
-                <w:b w:val="false"/>
-                <w:bCs w:val="false"/>
-                <w:sz w:val="20"/>
-                <w:szCs w:val="20"/>
-              </w:rPr>
-              <w:t xml:space="preserve">~98, accounting for promotion and relegation</w:t>
+            <w:del w:id="9018" w:author="Claude" w:date="2026-09-11T21:20:49Z">
+              <w:r>
+                <w:rPr>
+                  <w:b w:val="false"/>
+                  <w:bCs w:val="false"/>
+                  <w:sz w:val="20"/>
+                  <w:szCs w:val="20"/>
+                </w:rPr>
+                <w:delText xml:space="preserve">~98</w:delText>
+              </w:r>
+            </w:del>
+            <w:ins w:id="9019" w:author="Claude" w:date="2026-09-11T21:20:49Z">
+              <w:r>
+                <w:rPr>
+                  <w:b w:val="false"/>
+                  <w:bCs w:val="false"/>
+                  <w:sz w:val="20"/>
+                  <w:szCs w:val="20"/>
+                </w:rPr>
+                <w:t xml:space="preserve">145 across the window (98 per season, 96 in 2023/24)</w:t>
+              </w:r>
+            </w:ins>
+            <w:r>
+              <w:rPr>
+                <w:b w:val="false"/>
+                <w:bCs w:val="false"/>
+                <w:sz w:val="20"/>
+                <w:szCs w:val="20"/>
+              </w:rPr>
+              <w:t xml:space="preserve">, accounting for promotion and relegation</w:t>
             </w:r>
           </w:p>
         </w:tc>
@@ -928,15 +1003,28 @@
             </w:tcMar>
           </w:tcPr>
           <w:p>
-            <w:r>
-              <w:rPr>
-                <w:b w:val="false"/>
-                <w:bCs w:val="false"/>
-                <w:sz w:val="20"/>
-                <w:szCs w:val="20"/>
-              </w:rPr>
-              <w:t xml:space="preserve">The 2026/27 window — spend is known, output is not yet</w:t>
-            </w:r>
+            <w:del w:id="9020" w:author="Claude" w:date="2026-09-11T21:20:49Z">
+              <w:r>
+                <w:rPr>
+                  <w:b w:val="false"/>
+                  <w:bCs w:val="false"/>
+                  <w:sz w:val="20"/>
+                  <w:szCs w:val="20"/>
+                </w:rPr>
+                <w:delText xml:space="preserve">The 2026/27 window — spend is known, output is not yet</w:delText>
+              </w:r>
+            </w:del>
+            <w:ins w:id="9021" w:author="Claude" w:date="2026-09-11T21:20:49Z">
+              <w:r>
+                <w:rPr>
+                  <w:b w:val="false"/>
+                  <w:bCs w:val="false"/>
+                  <w:sz w:val="20"/>
+                  <w:szCs w:val="20"/>
+                </w:rPr>
+                <w:t xml:space="preserve">On-field output after 2023/24, which can no longer be measured on the same basis (4.1). Later transfer windows, including 2026/27, are shown but not scored (4.8)</w:t>
+              </w:r>
+            </w:ins>
           </w:p>
         </w:tc>
       </w:tr>
@@ -1174,7 +1262,20 @@
         <w:spacing w:after="120" w:before="280"/>
       </w:pPr>
       <w:r>
-        <w:t xml:space="preserve">4.2  Why nine seasons rather than five</w:t>
+        <w:t xml:space="preserve">4.2  </w:t>
+      </w:r>
+      <w:del w:id="9022" w:author="Claude" w:date="2026-09-11T21:20:49Z">
+        <w:r>
+          <w:delText xml:space="preserve">Why nine seasons</w:delText>
+        </w:r>
+      </w:del>
+      <w:ins w:id="9023" w:author="Claude" w:date="2026-09-11T21:20:49Z">
+        <w:r>
+          <w:t xml:space="preserve">Why seven seasons</w:t>
+        </w:r>
+      </w:ins>
+      <w:r>
+        <w:t xml:space="preserve"> rather than five</w:t>
       </w:r>
     </w:p>
     <w:p>
@@ -1188,29 +1289,81 @@
         </w:rPr>
         <w:t xml:space="preserve">An earlier draft scoped five seasons and excluded the COVID-affected period entirely. That was reconsidered.</w:t>
       </w:r>
-    </w:p>
-    <w:p>
-      <w:pPr>
-        <w:spacing w:after="140"/>
-      </w:pPr>
-      <w:r>
-        <w:rPr>
-          <w:sz w:val="22"/>
-          <w:szCs w:val="22"/>
-        </w:rPr>
-        <w:t xml:space="preserve">The transfer market's COVID distortion was concentrated in the summer 2020 and summer 2021 windows, when spending fell roughly 40% and had not fully recovered. In a five-season window that period is 20% of the data and a genuine problem. In a nine-season window it is a controllable effect, and can be handled with a season-level control rather than by deletion.</w:t>
-      </w:r>
-    </w:p>
-    <w:p>
-      <w:pPr>
-        <w:spacing w:after="140"/>
-      </w:pPr>
-      <w:r>
-        <w:rPr>
-          <w:sz w:val="22"/>
-          <w:szCs w:val="22"/>
-        </w:rPr>
-        <w:t xml:space="preserve">Nine seasons also spans a much richer set of natural experiments: two distinct Chelsea ownership eras, the rise of Brighton and Brentford, the tightening of Financial Fair Play, and the Saudi Pro League's entry into the market.</w:t>
+      <w:ins w:id="9024" w:author="Claude" w:date="2026-09-11T21:20:49Z">
+        <w:r>
+          <w:rPr>
+            <w:sz w:val="22"/>
+            <w:szCs w:val="22"/>
+          </w:rPr>
+          <w:t xml:space="preserve"> The window was then set at nine seasons; the loss of FBref's advanced data (4.1) later fixed it at seven.</w:t>
+        </w:r>
+      </w:ins>
+    </w:p>
+    <w:p>
+      <w:pPr>
+        <w:spacing w:after="140"/>
+      </w:pPr>
+      <w:r>
+        <w:rPr>
+          <w:sz w:val="22"/>
+          <w:szCs w:val="22"/>
+        </w:rPr>
+        <w:t xml:space="preserve">The transfer market's COVID distortion was concentrated in the summer 2020 and summer 2021 windows, when spending fell roughly 40% and had not fully recovered. In a five-season window that period is 20% of the data and a genuine problem. </w:t>
+      </w:r>
+      <w:del w:id="9025" w:author="Claude" w:date="2026-09-11T21:20:49Z">
+        <w:r>
+          <w:rPr>
+            <w:sz w:val="22"/>
+            <w:szCs w:val="22"/>
+          </w:rPr>
+          <w:delText xml:space="preserve">In a nine-season window it is a controllable effect</w:delText>
+        </w:r>
+      </w:del>
+      <w:ins w:id="9026" w:author="Claude" w:date="2026-09-11T21:20:49Z">
+        <w:r>
+          <w:rPr>
+            <w:sz w:val="22"/>
+            <w:szCs w:val="22"/>
+          </w:rPr>
+          <w:t xml:space="preserve">In a seven-season window it is a smaller, controllable effect</w:t>
+        </w:r>
+      </w:ins>
+      <w:r>
+        <w:rPr>
+          <w:sz w:val="22"/>
+          <w:szCs w:val="22"/>
+        </w:rPr>
+        <w:t xml:space="preserve">, and can be handled with a season-level control rather than by deletion.</w:t>
+      </w:r>
+    </w:p>
+    <w:p>
+      <w:pPr>
+        <w:spacing w:after="140"/>
+      </w:pPr>
+      <w:del w:id="9027" w:author="Claude" w:date="2026-09-11T21:20:49Z">
+        <w:r>
+          <w:rPr>
+            <w:sz w:val="22"/>
+            <w:szCs w:val="22"/>
+          </w:rPr>
+          <w:delText xml:space="preserve">Nine seasons also spans</w:delText>
+        </w:r>
+      </w:del>
+      <w:ins w:id="9028" w:author="Claude" w:date="2026-09-11T21:20:49Z">
+        <w:r>
+          <w:rPr>
+            <w:sz w:val="22"/>
+            <w:szCs w:val="22"/>
+          </w:rPr>
+          <w:t xml:space="preserve">Seven seasons still spans</w:t>
+        </w:r>
+      </w:ins>
+      <w:r>
+        <w:rPr>
+          <w:sz w:val="22"/>
+          <w:szCs w:val="22"/>
+        </w:rPr>
+        <w:t xml:space="preserve"> a much richer set of natural experiments: two distinct Chelsea ownership eras, the rise of Brighton and Brentford, the tightening of Financial Fair Play, and the Saudi Pro League's entry into the market.</w:t>
       </w:r>
     </w:p>
     <w:p>
@@ -1235,7 +1388,44 @@
           <w:sz w:val="22"/>
           <w:szCs w:val="22"/>
         </w:rPr>
-        <w:t xml:space="preserve">The risk of a nine-year window is </w:t>
+        <w:t xml:space="preserve">The risk of a </w:t>
+      </w:r>
+      <w:del w:id="9029" w:author="Claude" w:date="2026-09-11T21:20:49Z">
+        <w:r>
+          <w:rPr>
+            <w:b w:val="false"/>
+            <w:bCs w:val="false"/>
+            <w:i w:val="false"/>
+            <w:iCs w:val="false"/>
+            <w:sz w:val="22"/>
+            <w:szCs w:val="22"/>
+          </w:rPr>
+          <w:delText xml:space="preserve">nine-year window</w:delText>
+        </w:r>
+      </w:del>
+      <w:ins w:id="9030" w:author="Claude" w:date="2026-09-11T21:20:49Z">
+        <w:r>
+          <w:rPr>
+            <w:b w:val="false"/>
+            <w:bCs w:val="false"/>
+            <w:i w:val="false"/>
+            <w:iCs w:val="false"/>
+            <w:sz w:val="22"/>
+            <w:szCs w:val="22"/>
+          </w:rPr>
+          <w:t xml:space="preserve">seven-year window</w:t>
+        </w:r>
+      </w:ins>
+      <w:r>
+        <w:rPr>
+          <w:b w:val="false"/>
+          <w:bCs w:val="false"/>
+          <w:i w:val="false"/>
+          <w:iCs w:val="false"/>
+          <w:sz w:val="22"/>
+          <w:szCs w:val="22"/>
+        </w:rPr>
+        <w:t xml:space="preserve"> is </w:t>
       </w:r>
       <w:r>
         <w:rPr>
@@ -1295,7 +1485,81 @@
           <w:sz w:val="22"/>
           <w:szCs w:val="22"/>
         </w:rPr>
-        <w:t xml:space="preserve">. Newcastle in 2017 and Newcastle in 2025 are different organizations with different owners, budgets and strategies. Chelsea before and after the Boehly takeover are barely comparable entities. Collapsing nine years into a single average can blend two genuinely different clubs into a meaningless middle number.</w:t>
+        <w:t xml:space="preserve">. Newcastle in 2017 and </w:t>
+      </w:r>
+      <w:del w:id="9031" w:author="Claude" w:date="2026-09-11T21:20:49Z">
+        <w:r>
+          <w:rPr>
+            <w:b w:val="false"/>
+            <w:bCs w:val="false"/>
+            <w:i w:val="false"/>
+            <w:iCs w:val="false"/>
+            <w:sz w:val="22"/>
+            <w:szCs w:val="22"/>
+          </w:rPr>
+          <w:delText xml:space="preserve">Newcastle in 2025</w:delText>
+        </w:r>
+      </w:del>
+      <w:ins w:id="9032" w:author="Claude" w:date="2026-09-11T21:20:49Z">
+        <w:r>
+          <w:rPr>
+            <w:b w:val="false"/>
+            <w:bCs w:val="false"/>
+            <w:i w:val="false"/>
+            <w:iCs w:val="false"/>
+            <w:sz w:val="22"/>
+            <w:szCs w:val="22"/>
+          </w:rPr>
+          <w:t xml:space="preserve">Newcastle in 2024</w:t>
+        </w:r>
+      </w:ins>
+      <w:r>
+        <w:rPr>
+          <w:b w:val="false"/>
+          <w:bCs w:val="false"/>
+          <w:i w:val="false"/>
+          <w:iCs w:val="false"/>
+          <w:sz w:val="22"/>
+          <w:szCs w:val="22"/>
+        </w:rPr>
+        <w:t xml:space="preserve"> are different organizations with different owners, budgets and strategies. Chelsea before and after the Boehly takeover are barely comparable entities. </w:t>
+      </w:r>
+      <w:del w:id="9033" w:author="Claude" w:date="2026-09-11T21:20:49Z">
+        <w:r>
+          <w:rPr>
+            <w:b w:val="false"/>
+            <w:bCs w:val="false"/>
+            <w:i w:val="false"/>
+            <w:iCs w:val="false"/>
+            <w:sz w:val="22"/>
+            <w:szCs w:val="22"/>
+          </w:rPr>
+          <w:delText xml:space="preserve">Collapsing nine years</w:delText>
+        </w:r>
+      </w:del>
+      <w:ins w:id="9034" w:author="Claude" w:date="2026-09-11T21:20:49Z">
+        <w:r>
+          <w:rPr>
+            <w:b w:val="false"/>
+            <w:bCs w:val="false"/>
+            <w:i w:val="false"/>
+            <w:iCs w:val="false"/>
+            <w:sz w:val="22"/>
+            <w:szCs w:val="22"/>
+          </w:rPr>
+          <w:t xml:space="preserve">Collapsing seven years</w:t>
+        </w:r>
+      </w:ins>
+      <w:r>
+        <w:rPr>
+          <w:b w:val="false"/>
+          <w:bCs w:val="false"/>
+          <w:i w:val="false"/>
+          <w:iCs w:val="false"/>
+          <w:sz w:val="22"/>
+          <w:szCs w:val="22"/>
+        </w:rPr>
+        <w:t xml:space="preserve"> into a single average can blend two genuinely different clubs into a meaningless middle number.</w:t>
       </w:r>
     </w:p>
     <w:p>
@@ -1322,7 +1586,81 @@
           <w:sz w:val="22"/>
           <w:szCs w:val="22"/>
         </w:rPr>
-        <w:t xml:space="preserve">efficiency is computed per club per season, and reported as a trend, not only as a nine-year aggregate. Season filters let a reader compare 2017–2021 against 2022–2026 directly.</w:t>
+        <w:t xml:space="preserve">efficiency is computed per club per season, and reported as a trend, not only as a </w:t>
+      </w:r>
+      <w:del w:id="9035" w:author="Claude" w:date="2026-09-11T21:20:49Z">
+        <w:r>
+          <w:rPr>
+            <w:b w:val="false"/>
+            <w:bCs w:val="false"/>
+            <w:i w:val="false"/>
+            <w:iCs w:val="false"/>
+            <w:sz w:val="22"/>
+            <w:szCs w:val="22"/>
+          </w:rPr>
+          <w:delText xml:space="preserve">nine-year aggregate</w:delText>
+        </w:r>
+      </w:del>
+      <w:ins w:id="9036" w:author="Claude" w:date="2026-09-11T21:20:49Z">
+        <w:r>
+          <w:rPr>
+            <w:b w:val="false"/>
+            <w:bCs w:val="false"/>
+            <w:i w:val="false"/>
+            <w:iCs w:val="false"/>
+            <w:sz w:val="22"/>
+            <w:szCs w:val="22"/>
+          </w:rPr>
+          <w:t xml:space="preserve">seven-year aggregate</w:t>
+        </w:r>
+      </w:ins>
+      <w:r>
+        <w:rPr>
+          <w:b w:val="false"/>
+          <w:bCs w:val="false"/>
+          <w:i w:val="false"/>
+          <w:iCs w:val="false"/>
+          <w:sz w:val="22"/>
+          <w:szCs w:val="22"/>
+        </w:rPr>
+        <w:t xml:space="preserve">. Season filters let a reader </w:t>
+      </w:r>
+      <w:del w:id="9037" w:author="Claude" w:date="2026-09-11T21:20:49Z">
+        <w:r>
+          <w:rPr>
+            <w:b w:val="false"/>
+            <w:bCs w:val="false"/>
+            <w:i w:val="false"/>
+            <w:iCs w:val="false"/>
+            <w:sz w:val="22"/>
+            <w:szCs w:val="22"/>
+          </w:rPr>
+          <w:delText xml:space="preserve">compare 2017–2021 against 2022–2026 directly</w:delText>
+        </w:r>
+      </w:del>
+      <w:ins w:id="9038" w:author="Claude" w:date="2026-09-11T21:20:49Z">
+        <w:r>
+          <w:rPr>
+            <w:b w:val="false"/>
+            <w:bCs w:val="false"/>
+            <w:i w:val="false"/>
+            <w:iCs w:val="false"/>
+            <w:sz w:val="22"/>
+            <w:szCs w:val="22"/>
+          </w:rPr>
+          <w:t xml:space="preserve">compare 2017/18–2020/21 against 2021/22–2023/24 directly</w:t>
+        </w:r>
+      </w:ins>
+      <w:r>
+        <w:rPr>
+          <w:b w:val="false"/>
+          <w:bCs w:val="false"/>
+          <w:i w:val="false"/>
+          <w:iCs w:val="false"/>
+          <w:sz w:val="22"/>
+          <w:szCs w:val="22"/>
+        </w:rPr>
+        <w:t xml:space="preserve">.</w:t>
       </w:r>
     </w:p>
     <w:p>
@@ -1916,7 +2254,32 @@
           <w:sz w:val="22"/>
           <w:szCs w:val="22"/>
         </w:rPr>
-        <w:t xml:space="preserve">They are excluded initially because wage data requires an additional and less reliable scraping source, and because fee data alone is complete and consistent across all nine seasons. Adding a fragile dependency before the core pipeline works would risk the whole build.</w:t>
+        <w:t xml:space="preserve">They are excluded initially because wage data requires an additional and less reliable scraping source, and because fee data alone is complete and consistent </w:t>
+      </w:r>
+      <w:del w:id="9043" w:author="Claude" w:date="2026-09-11T21:20:49Z">
+        <w:r>
+          <w:rPr>
+            <w:sz w:val="22"/>
+            <w:szCs w:val="22"/>
+          </w:rPr>
+          <w:delText xml:space="preserve">across all nine seasons</w:delText>
+        </w:r>
+      </w:del>
+      <w:ins w:id="9044" w:author="Claude" w:date="2026-09-11T21:20:49Z">
+        <w:r>
+          <w:rPr>
+            <w:sz w:val="22"/>
+            <w:szCs w:val="22"/>
+          </w:rPr>
+          <w:t xml:space="preserve">across all seven seasons</w:t>
+        </w:r>
+      </w:ins>
+      <w:r>
+        <w:rPr>
+          <w:sz w:val="22"/>
+          <w:szCs w:val="22"/>
+        </w:rPr>
+        <w:t xml:space="preserve">. Adding a fragile dependency before the core pipeline works would risk the whole build.</w:t>
       </w:r>
     </w:p>
     <w:p>
@@ -2024,7 +2387,32 @@
           <w:sz w:val="22"/>
           <w:szCs w:val="22"/>
         </w:rPr>
-        <w:t xml:space="preserve">Because efficiency is tracked over nine seasons, a natural question follows: does the trend move when the manager changes? The club page answers this with a single full-width panel combining three layers — an efficiency trend strip, per-season transfer cash flow, and manager tenure bands.</w:t>
+        <w:t xml:space="preserve">Because efficiency is tracked </w:t>
+      </w:r>
+      <w:del w:id="9039" w:author="Claude" w:date="2026-09-11T21:20:49Z">
+        <w:r>
+          <w:rPr>
+            <w:sz w:val="22"/>
+            <w:szCs w:val="22"/>
+          </w:rPr>
+          <w:delText xml:space="preserve">over nine seasons</w:delText>
+        </w:r>
+      </w:del>
+      <w:ins w:id="9040" w:author="Claude" w:date="2026-09-11T21:20:49Z">
+        <w:r>
+          <w:rPr>
+            <w:sz w:val="22"/>
+            <w:szCs w:val="22"/>
+          </w:rPr>
+          <w:t xml:space="preserve">over seven seasons</w:t>
+        </w:r>
+      </w:ins>
+      <w:r>
+        <w:rPr>
+          <w:sz w:val="22"/>
+          <w:szCs w:val="22"/>
+        </w:rPr>
+        <w:t xml:space="preserve">, a natural question follows: does the trend move when the manager changes? The club page answers this with a single full-width panel combining three layers — an efficiency trend strip, per-season transfer cash flow, and manager tenure bands.</w:t>
       </w:r>
     </w:p>
     <w:p>
@@ -2515,7 +2903,44 @@
           <w:sz w:val="22"/>
           <w:szCs w:val="22"/>
         </w:rPr>
-        <w:t xml:space="preserve">Rather than assigning weights by judgment, each pillar is regressed against actual sporting success across the nine seasons, and the coefficients set the weights. The model is answerable to the data rather than to the analyst's priors.</w:t>
+        <w:t xml:space="preserve">Rather than assigning weights by judgment, each pillar is regressed against actual sporting success </w:t>
+      </w:r>
+      <w:del w:id="9041" w:author="Claude" w:date="2026-09-11T21:20:49Z">
+        <w:r>
+          <w:rPr>
+            <w:b w:val="false"/>
+            <w:bCs w:val="false"/>
+            <w:i w:val="false"/>
+            <w:iCs w:val="false"/>
+            <w:sz w:val="22"/>
+            <w:szCs w:val="22"/>
+          </w:rPr>
+          <w:delText xml:space="preserve">across the nine seasons</w:delText>
+        </w:r>
+      </w:del>
+      <w:ins w:id="9042" w:author="Claude" w:date="2026-09-11T21:20:49Z">
+        <w:r>
+          <w:rPr>
+            <w:b w:val="false"/>
+            <w:bCs w:val="false"/>
+            <w:i w:val="false"/>
+            <w:iCs w:val="false"/>
+            <w:sz w:val="22"/>
+            <w:szCs w:val="22"/>
+          </w:rPr>
+          <w:t xml:space="preserve">across the seven seasons</w:t>
+        </w:r>
+      </w:ins>
+      <w:r>
+        <w:rPr>
+          <w:b w:val="false"/>
+          <w:bCs w:val="false"/>
+          <w:i w:val="false"/>
+          <w:iCs w:val="false"/>
+          <w:sz w:val="22"/>
+          <w:szCs w:val="22"/>
+        </w:rPr>
+        <w:t xml:space="preserve">, and the coefficients set the weights. The model is answerable to the data rather than to the analyst's priors.</w:t>
       </w:r>
     </w:p>
     <w:p>
@@ -3322,6 +3747,17 @@
               </w:rPr>
               <w:t xml:space="preserve">Highest risk in the project. "Man Utd" / "Manchester United" / "Manchester Utd" all refer to one club. Projects like this commonly stall here</w:t>
             </w:r>
+            <w:ins w:id="9045" w:author="Claude" w:date="2026-09-11T21:20:49Z">
+              <w:r>
+                <w:rPr>
+                  <w:b w:val="false"/>
+                  <w:bCs w:val="false"/>
+                  <w:sz w:val="20"/>
+                  <w:szCs w:val="20"/>
+                </w:rPr>
+                <w:t xml:space="preserve">. Names change even within one source: FBref lists Borussia Mönchengladbach as "M'Gladbach", then "Gladbach", under the same team ID</w:t>
+              </w:r>
+            </w:ins>
           </w:p>
         </w:tc>
         <w:tc>
@@ -3342,7 +3778,38 @@
                 <w:sz w:val="20"/>
                 <w:szCs w:val="20"/>
               </w:rPr>
-              <w:t xml:space="preserve">worldfootballR's player dictionary handles players; a manual club mapping table handles clubs. Time budgeted explicitly</w:t>
+              <w:t xml:space="preserve">worldfootballR's player dictionary handles players; </w:t>
+            </w:r>
+            <w:del w:id="9046" w:author="Claude" w:date="2026-09-11T21:20:49Z">
+              <w:r>
+                <w:rPr>
+                  <w:b w:val="false"/>
+                  <w:bCs w:val="false"/>
+                  <w:sz w:val="20"/>
+                  <w:szCs w:val="20"/>
+                </w:rPr>
+                <w:delText xml:space="preserve">a manual club mapping table handles clubs</w:delText>
+              </w:r>
+            </w:del>
+            <w:ins w:id="9047" w:author="Claude" w:date="2026-09-11T21:20:49Z">
+              <w:r>
+                <w:rPr>
+                  <w:b w:val="false"/>
+                  <w:bCs w:val="false"/>
+                  <w:sz w:val="20"/>
+                  <w:szCs w:val="20"/>
+                </w:rPr>
+                <w:t xml:space="preserve">a manual club mapping table, keyed on FBref team IDs rather than names, handles clubs</w:t>
+              </w:r>
+            </w:ins>
+            <w:r>
+              <w:rPr>
+                <w:b w:val="false"/>
+                <w:bCs w:val="false"/>
+                <w:sz w:val="20"/>
+                <w:szCs w:val="20"/>
+              </w:rPr>
+              <w:t xml:space="preserve">. Time budgeted explicitly</w:t>
             </w:r>
           </w:p>
         </w:tc>
@@ -3362,15 +3829,28 @@
             </w:tcMar>
           </w:tcPr>
           <w:p>
-            <w:r>
-              <w:rPr>
-                <w:b w:val="false"/>
-                <w:bCs w:val="false"/>
-                <w:sz w:val="20"/>
-                <w:szCs w:val="20"/>
-              </w:rPr>
-              <w:t xml:space="preserve">Scraper fragility</w:t>
-            </w:r>
+            <w:del w:id="9052" w:author="Claude" w:date="2026-09-11T21:20:49Z">
+              <w:r>
+                <w:rPr>
+                  <w:b w:val="false"/>
+                  <w:bCs w:val="false"/>
+                  <w:sz w:val="20"/>
+                  <w:szCs w:val="20"/>
+                </w:rPr>
+                <w:delText xml:space="preserve">Scraper fragility</w:delText>
+              </w:r>
+            </w:del>
+            <w:ins w:id="9053" w:author="Claude" w:date="2026-09-11T21:20:49Z">
+              <w:r>
+                <w:rPr>
+                  <w:b w:val="false"/>
+                  <w:bCs w:val="false"/>
+                  <w:sz w:val="20"/>
+                  <w:szCs w:val="20"/>
+                </w:rPr>
+                <w:t xml:space="preserve">FBref access and data availability</w:t>
+              </w:r>
+            </w:ins>
           </w:p>
         </w:tc>
         <w:tc>
@@ -3384,15 +3864,28 @@
             </w:tcMar>
           </w:tcPr>
           <w:p>
-            <w:r>
-              <w:rPr>
-                <w:b w:val="false"/>
-                <w:bCs w:val="false"/>
-                <w:sz w:val="20"/>
-                <w:szCs w:val="20"/>
-              </w:rPr>
-              <w:t xml:space="preserve">FBref rate-limits; a nine-season pull is a multi-hour unattended job</w:t>
-            </w:r>
+            <w:del w:id="9048" w:author="Claude" w:date="2026-09-11T21:20:49Z">
+              <w:r>
+                <w:rPr>
+                  <w:b w:val="false"/>
+                  <w:bCs w:val="false"/>
+                  <w:sz w:val="20"/>
+                  <w:szCs w:val="20"/>
+                </w:rPr>
+                <w:delText xml:space="preserve">FBref rate-limits; a nine-season pull is a multi-hour unattended job</w:delText>
+              </w:r>
+            </w:del>
+            <w:ins w:id="9049" w:author="Claude" w:date="2026-09-11T21:20:49Z">
+              <w:r>
+                <w:rPr>
+                  <w:b w:val="false"/>
+                  <w:bCs w:val="false"/>
+                  <w:sz w:val="20"/>
+                  <w:szCs w:val="20"/>
+                </w:rPr>
+                <w:t xml:space="preserve">Materialised, then superseded. FBref blocks automated clients, and on 20 January 2026 lost its advanced data entirely (4.1)</w:t>
+              </w:r>
+            </w:ins>
           </w:p>
         </w:tc>
         <w:tc>
@@ -3406,15 +3899,28 @@
             </w:tcMar>
           </w:tcPr>
           <w:p>
-            <w:r>
-              <w:rPr>
-                <w:b w:val="false"/>
-                <w:bCs w:val="false"/>
-                <w:sz w:val="20"/>
-                <w:szCs w:val="20"/>
-              </w:rPr>
-              <w:t xml:space="preserve">Test on one season before the full run. Cache aggressively</w:t>
-            </w:r>
+            <w:del w:id="9050" w:author="Claude" w:date="2026-09-11T21:20:49Z">
+              <w:r>
+                <w:rPr>
+                  <w:b w:val="false"/>
+                  <w:bCs w:val="false"/>
+                  <w:sz w:val="20"/>
+                  <w:szCs w:val="20"/>
+                </w:rPr>
+                <w:delText xml:space="preserve">Test on one season before the full run. Cache aggressively</w:delText>
+              </w:r>
+            </w:del>
+            <w:ins w:id="9051" w:author="Claude" w:date="2026-09-11T21:20:49Z">
+              <w:r>
+                <w:rPr>
+                  <w:b w:val="false"/>
+                  <w:bCs w:val="false"/>
+                  <w:sz w:val="20"/>
+                  <w:szCs w:val="20"/>
+                </w:rPr>
+                <w:t xml:space="preserve">No live scraping of FBref. The frozen worldfootballR snapshot is archived locally with a checksummed manifest; shot-creating actions come from a Kaggle copy validated against it</w:t>
+              </w:r>
+            </w:ins>
           </w:p>
         </w:tc>
       </w:tr>

</xml_diff>

<commit_message>
Scoping doc: settle 4.9 and the architecture table with transfermarkt-datasets
Tracked changes (author "Claude"):
- 4.9 data source: manager tenures from the per-match manager names in
  transfermarkt-datasets (no official dates, no manager IDs); fees paid
  and received summed from its transfers, loan fees excluded
- section 6: the "To be decided" manager-tenure row and paragraph now
  name transfermarkt-datasets (edited within Claude's earlier, still
  unaccepted insertions)
- appendix: club-page spending breakdown is permanent vs free transfers
  and loans combined; the largest-transfers filter is bought / sold
- section 7: the loan risk row is now verified and accepted

Rejecting every change restores the original text exactly.

Co-Authored-By: Claude Opus 5 <noreply@anthropic.com>
</commit_message>
<xml_diff>
--- a/docs/Transfer-Market-Efficiency-Scoping-Doc.docx
+++ b/docs/Transfer-Market-Efficiency-Scoping-Doc.docx
@@ -2659,17 +2659,32 @@
         </w:rPr>
         <w:t xml:space="preserve">Data source: </w:t>
       </w:r>
-      <w:r>
-        <w:rPr>
-          <w:b w:val="false"/>
-          <w:bCs w:val="false"/>
-          <w:i w:val="false"/>
-          <w:iCs w:val="false"/>
-          <w:sz w:val="22"/>
-          <w:szCs w:val="22"/>
-        </w:rPr>
-        <w:t xml:space="preserve">worldfootballR's tm_team_staff_history() supplies manager tenures with dates, and tm_team_transfer_balances() supplies per-season fees paid and received. Both originate from Transfermarkt and join cleanly to data already being ingested.</w:t>
-      </w:r>
+      <w:del w:id="9081" w:author="Claude" w:date="2026-09-11T22:04:37Z">
+        <w:r>
+          <w:rPr>
+            <w:b w:val="false"/>
+            <w:bCs w:val="false"/>
+            <w:i w:val="false"/>
+            <w:iCs w:val="false"/>
+            <w:sz w:val="22"/>
+            <w:szCs w:val="22"/>
+          </w:rPr>
+          <w:delText xml:space="preserve">worldfootballR's tm_team_staff_history() supplies manager tenures with dates, and tm_team_transfer_balances() supplies per-season fees paid and received. Both originate from Transfermarkt and join cleanly to data already being ingested.</w:delText>
+        </w:r>
+      </w:del>
+      <w:ins w:id="9082" w:author="Claude" w:date="2026-09-11T22:04:37Z">
+        <w:r>
+          <w:rPr>
+            <w:b w:val="false"/>
+            <w:bCs w:val="false"/>
+            <w:i w:val="false"/>
+            <w:iCs w:val="false"/>
+            <w:sz w:val="22"/>
+            <w:szCs w:val="22"/>
+          </w:rPr>
+          <w:t xml:space="preserve">transfermarkt-datasets, a CC0-licensed build of Transfermarkt data that stopped updating in July 2026, names the manager for every match. Tenure bands are built from those per-match names, caretakers included, and drawn against season boundaries as described above. There are no official appointment or departure dates and no manager IDs, so names are checked by hand for spelling variants. Per-season fees paid and received are summed from the same dataset's transfers; loan fees aren't included (see 7).</w:t>
+        </w:r>
+      </w:ins>
     </w:p>
     <w:p>
       <w:pPr>
@@ -3215,7 +3230,7 @@
             <w:sz w:val="22"/>
             <w:szCs w:val="22"/>
           </w:rPr>
-          <w:t xml:space="preserve">worldfootballR itself was archived in September 2025 and is no longer a live dependency. Its FBref-to-Transfermarkt player dictionary is used as a frozen file from the same repository. The Transfermarkt data source, including manager tenures, is chosen separately.</w:t>
+          <w:t xml:space="preserve">worldfootballR itself was archived in September 2025 and is no longer a live dependency. Its FBref-to-Transfermarkt player dictionary is used as a frozen file from the same repository. Transfermarkt data, including the manager named for every match, comes from transfermarkt-datasets, a CC0-licensed build that stopped updating in July 2026.</w:t>
         </w:r>
       </w:ins>
     </w:p>
@@ -3401,7 +3416,7 @@
                   <w:sz w:val="20"/>
                   <w:szCs w:val="20"/>
                 </w:rPr>
-                <w:t xml:space="preserve">Freeze the FBref snapshot and Kaggle file with checksums; ingest Transfermarkt data; reshape and load into PostgreSQL</w:t>
+                <w:t xml:space="preserve">Freeze the FBref snapshot and Kaggle file with checksums; ingest Transfermarkt data from transfermarkt-datasets; reshape and load into PostgreSQL</w:t>
               </w:r>
             </w:ins>
           </w:p>
@@ -3560,7 +3575,7 @@
                   <w:sz w:val="20"/>
                   <w:szCs w:val="20"/>
                 </w:rPr>
-                <w:t xml:space="preserve">To be decided</w:t>
+                <w:t xml:space="preserve">Python (transfermarkt-datasets)</w:t>
               </w:r>
             </w:ins>
           </w:p>
@@ -3595,7 +3610,7 @@
                   <w:sz w:val="20"/>
                   <w:szCs w:val="20"/>
                 </w:rPr>
-                <w:t xml:space="preserve">Coach appointment and departure dates per club. The original source, worldfootballR, is archived; the replacement is chosen with the Transfermarkt data</w:t>
+                <w:t xml:space="preserve">Tenure bands from the manager named for every match; no official appointment or departure dates</w:t>
               </w:r>
             </w:ins>
           </w:p>
@@ -4246,15 +4261,28 @@
             </w:tcMar>
           </w:tcPr>
           <w:p>
-            <w:r>
-              <w:rPr>
-                <w:b w:val="false"/>
-                <w:bCs w:val="false"/>
-                <w:sz w:val="20"/>
-                <w:szCs w:val="20"/>
-              </w:rPr>
-              <w:t xml:space="preserve">Inconsistently recorded on Transfermarkt</w:t>
-            </w:r>
+            <w:del w:id="9087" w:author="Claude" w:date="2026-09-11T22:04:37Z">
+              <w:r>
+                <w:rPr>
+                  <w:b w:val="false"/>
+                  <w:bCs w:val="false"/>
+                  <w:sz w:val="20"/>
+                  <w:szCs w:val="20"/>
+                </w:rPr>
+                <w:delText xml:space="preserve">Inconsistently recorded on Transfermarkt</w:delText>
+              </w:r>
+            </w:del>
+            <w:ins w:id="9088" w:author="Claude" w:date="2026-09-11T22:04:37Z">
+              <w:r>
+                <w:rPr>
+                  <w:b w:val="false"/>
+                  <w:bCs w:val="false"/>
+                  <w:sz w:val="20"/>
+                  <w:szCs w:val="20"/>
+                </w:rPr>
+                <w:t xml:space="preserve">Verified: the Transfermarkt source records loans, loan returns and free transfers alike as a zero fee, and discards loan fees</w:t>
+              </w:r>
+            </w:ins>
           </w:p>
         </w:tc>
         <w:tc>
@@ -4268,15 +4296,28 @@
             </w:tcMar>
           </w:tcPr>
           <w:p>
-            <w:r>
-              <w:rPr>
-                <w:b w:val="false"/>
-                <w:bCs w:val="false"/>
-                <w:sz w:val="20"/>
-                <w:szCs w:val="20"/>
-              </w:rPr>
-              <w:t xml:space="preserve">Verify availability before building dependent visuals</w:t>
-            </w:r>
+            <w:del w:id="9089" w:author="Claude" w:date="2026-09-11T22:04:37Z">
+              <w:r>
+                <w:rPr>
+                  <w:b w:val="false"/>
+                  <w:bCs w:val="false"/>
+                  <w:sz w:val="20"/>
+                  <w:szCs w:val="20"/>
+                </w:rPr>
+                <w:delText xml:space="preserve">Verify availability before building dependent visuals</w:delText>
+              </w:r>
+            </w:del>
+            <w:ins w:id="9090" w:author="Claude" w:date="2026-09-11T22:04:37Z">
+              <w:r>
+                <w:rPr>
+                  <w:b w:val="false"/>
+                  <w:bCs w:val="false"/>
+                  <w:sz w:val="20"/>
+                  <w:szCs w:val="20"/>
+                </w:rPr>
+                <w:t xml:space="preserve">Accepted and documented in the coverage map: spending is split into permanent transfers vs free transfers and loans; loan fees aren't counted; revisited if loan-heavy clubs look mis-scored</w:t>
+              </w:r>
+            </w:ins>
           </w:p>
         </w:tc>
       </w:tr>
@@ -4658,7 +4699,57 @@
           <w:sz w:val="22"/>
           <w:szCs w:val="22"/>
         </w:rPr>
-        <w:t xml:space="preserve">Lets a reader inspect any single club. Squad with market values and nationality, the club's efficiency score broken into its four component pillars, a spending breakdown split by permanent, loan and free transfers, largest transfers with a bought / sold / loan filter, honors, and — across the full width beneath — the combined cash flow and manager tenure panel described in section 4.9.</w:t>
+        <w:t xml:space="preserve">Lets a reader inspect any single club. Squad with market values and nationality, the club's efficiency score broken into its four component pillars, </w:t>
+      </w:r>
+      <w:del w:id="9083" w:author="Claude" w:date="2026-09-11T22:04:37Z">
+        <w:r>
+          <w:rPr>
+            <w:sz w:val="22"/>
+            <w:szCs w:val="22"/>
+          </w:rPr>
+          <w:delText xml:space="preserve">a spending breakdown split by permanent, loan and free transfers</w:delText>
+        </w:r>
+      </w:del>
+      <w:ins w:id="9084" w:author="Claude" w:date="2026-09-11T22:04:37Z">
+        <w:r>
+          <w:rPr>
+            <w:sz w:val="22"/>
+            <w:szCs w:val="22"/>
+          </w:rPr>
+          <w:t xml:space="preserve">a spending breakdown split into permanent transfers and free transfers or loans combined (loan fees can't be recovered; see section 7)</w:t>
+        </w:r>
+      </w:ins>
+      <w:r>
+        <w:rPr>
+          <w:sz w:val="22"/>
+          <w:szCs w:val="22"/>
+        </w:rPr>
+        <w:t xml:space="preserve">, largest transfers with </w:t>
+      </w:r>
+      <w:del w:id="9085" w:author="Claude" w:date="2026-09-11T22:04:37Z">
+        <w:r>
+          <w:rPr>
+            <w:sz w:val="22"/>
+            <w:szCs w:val="22"/>
+          </w:rPr>
+          <w:delText xml:space="preserve">a bought / sold / loan filter</w:delText>
+        </w:r>
+      </w:del>
+      <w:ins w:id="9086" w:author="Claude" w:date="2026-09-11T22:04:37Z">
+        <w:r>
+          <w:rPr>
+            <w:sz w:val="22"/>
+            <w:szCs w:val="22"/>
+          </w:rPr>
+          <w:t xml:space="preserve">a bought / sold filter</w:t>
+        </w:r>
+      </w:ins>
+      <w:r>
+        <w:rPr>
+          <w:sz w:val="22"/>
+          <w:szCs w:val="22"/>
+        </w:rPr>
+        <w:t xml:space="preserve">, honors, and — across the full width beneath — the combined cash flow and manager tenure panel described in section 4.9.</w:t>
       </w:r>
     </w:p>
     <w:p>

</xml_diff>

<commit_message>
Scoping doc: accept Claude's tracked changes
Accepts all 90 tracked changes authored by "Claude" (47 inserted runs,
8 inserted paragraphs, 35 deletions), made across sections 1, 3, 4.1,
4.2, 4.3, 4.7, 4.8, 4.9, 5, 6, 7 and the appendix. They were the only
tracked changes in the document. The accepted text is identical to the
"accept all" view of the reviewed version, and only word/document.xml
changed.

Co-Authored-By: Claude Opus 5 <noreply@anthropic.com>
</commit_message>
<xml_diff>
--- a/docs/Transfer-Market-Efficiency-Scoping-Doc.docx
+++ b/docs/Transfer-Market-Efficiency-Scoping-Doc.docx
@@ -374,28 +374,15 @@
         </w:rPr>
         <w:t xml:space="preserve">Which clubs in Europe's top five leagues extract the most on-field value per euro spent in the transfer market, which burn the most money for the least return, and — </w:t>
       </w:r>
-      <w:del w:id="9014" w:author="Claude" w:date="2026-09-11T21:20:49Z">
-        <w:r>
-          <w:rPr>
-            <w:i/>
-            <w:iCs/>
-            <w:sz w:val="22"/>
-            <w:szCs w:val="22"/>
-          </w:rPr>
-          <w:delText xml:space="preserve">over nine seasons</w:delText>
-        </w:r>
-      </w:del>
-      <w:ins w:id="9015" w:author="Claude" w:date="2026-09-11T21:20:49Z">
-        <w:r>
-          <w:rPr>
-            <w:i/>
-            <w:iCs/>
-            <w:sz w:val="22"/>
-            <w:szCs w:val="22"/>
-          </w:rPr>
-          <w:t xml:space="preserve">over seven seasons</w:t>
-        </w:r>
-      </w:ins>
+      <w:r>
+        <w:rPr>
+          <w:i/>
+          <w:iCs/>
+          <w:sz w:val="22"/>
+          <w:szCs w:val="22"/>
+        </w:rPr>
+        <w:t xml:space="preserve">over seven seasons</w:t>
+      </w:r>
       <w:r>
         <w:rPr>
           <w:i/>
@@ -772,28 +759,15 @@
               </w:rPr>
               <w:t xml:space="preserve">2017/18 – </w:t>
             </w:r>
-            <w:del w:id="9016" w:author="Claude" w:date="2026-09-11T21:20:49Z">
-              <w:r>
-                <w:rPr>
-                  <w:b w:val="false"/>
-                  <w:bCs w:val="false"/>
-                  <w:sz w:val="20"/>
-                  <w:szCs w:val="20"/>
-                </w:rPr>
-                <w:delText xml:space="preserve">2025/26 (nine complete seasons)</w:delText>
-              </w:r>
-            </w:del>
-            <w:ins w:id="9017" w:author="Claude" w:date="2026-09-11T21:20:49Z">
-              <w:r>
-                <w:rPr>
-                  <w:b w:val="false"/>
-                  <w:bCs w:val="false"/>
-                  <w:sz w:val="20"/>
-                  <w:szCs w:val="20"/>
-                </w:rPr>
-                <w:t xml:space="preserve">2023/24 (seven complete seasons; see 4.1)</w:t>
-              </w:r>
-            </w:ins>
+            <w:r>
+              <w:rPr>
+                <w:b w:val="false"/>
+                <w:bCs w:val="false"/>
+                <w:sz w:val="20"/>
+                <w:szCs w:val="20"/>
+              </w:rPr>
+              <w:t xml:space="preserve">2023/24 (seven complete seasons; see 4.1)</w:t>
+            </w:r>
           </w:p>
         </w:tc>
       </w:tr>
@@ -834,28 +808,15 @@
             </w:tcMar>
           </w:tcPr>
           <w:p>
-            <w:del w:id="9018" w:author="Claude" w:date="2026-09-11T21:20:49Z">
-              <w:r>
-                <w:rPr>
-                  <w:b w:val="false"/>
-                  <w:bCs w:val="false"/>
-                  <w:sz w:val="20"/>
-                  <w:szCs w:val="20"/>
-                </w:rPr>
-                <w:delText xml:space="preserve">~98</w:delText>
-              </w:r>
-            </w:del>
-            <w:ins w:id="9019" w:author="Claude" w:date="2026-09-11T21:20:49Z">
-              <w:r>
-                <w:rPr>
-                  <w:b w:val="false"/>
-                  <w:bCs w:val="false"/>
-                  <w:sz w:val="20"/>
-                  <w:szCs w:val="20"/>
-                </w:rPr>
-                <w:t xml:space="preserve">145 across the window (98 per season, 96 in 2023/24)</w:t>
-              </w:r>
-            </w:ins>
+            <w:r>
+              <w:rPr>
+                <w:b w:val="false"/>
+                <w:bCs w:val="false"/>
+                <w:sz w:val="20"/>
+                <w:szCs w:val="20"/>
+              </w:rPr>
+              <w:t xml:space="preserve">145 across the window (98 per season, 96 in 2023/24)</w:t>
+            </w:r>
             <w:r>
               <w:rPr>
                 <w:b w:val="false"/>
@@ -1003,28 +964,15 @@
             </w:tcMar>
           </w:tcPr>
           <w:p>
-            <w:del w:id="9020" w:author="Claude" w:date="2026-09-11T21:20:49Z">
-              <w:r>
-                <w:rPr>
-                  <w:b w:val="false"/>
-                  <w:bCs w:val="false"/>
-                  <w:sz w:val="20"/>
-                  <w:szCs w:val="20"/>
-                </w:rPr>
-                <w:delText xml:space="preserve">The 2026/27 window — spend is known, output is not yet</w:delText>
-              </w:r>
-            </w:del>
-            <w:ins w:id="9021" w:author="Claude" w:date="2026-09-11T21:20:49Z">
-              <w:r>
-                <w:rPr>
-                  <w:b w:val="false"/>
-                  <w:bCs w:val="false"/>
-                  <w:sz w:val="20"/>
-                  <w:szCs w:val="20"/>
-                </w:rPr>
-                <w:t xml:space="preserve">On-field output after 2023/24, which can no longer be measured on the same basis (4.1). Later transfer windows, including 2026/27, are shown but not scored (4.8)</w:t>
-              </w:r>
-            </w:ins>
+            <w:r>
+              <w:rPr>
+                <w:b w:val="false"/>
+                <w:bCs w:val="false"/>
+                <w:sz w:val="20"/>
+                <w:szCs w:val="20"/>
+              </w:rPr>
+              <w:t xml:space="preserve">On-field output after 2023/24, which can no longer be measured on the same basis (4.1). Later transfer windows, including 2026/27, are shown but not scored (4.8)</w:t>
+            </w:r>
           </w:p>
         </w:tc>
       </w:tr>
@@ -1058,12 +1006,10 @@
       <w:r>
         <w:t xml:space="preserve">4.1  Why the window starts at 2017/18</w:t>
       </w:r>
-      <w:ins w:id="9001" w:author="Claude" w:date="2026-09-11T21:00:07Z">
-        <w:r>
-          <w:rPr/>
-          <w:t xml:space="preserve"> and ends at 2023/24</w:t>
-        </w:r>
-      </w:ins>
+      <w:r>
+        <w:rPr/>
+        <w:t xml:space="preserve"> and ends at 2023/24</w:t>
+      </w:r>
     </w:p>
     <w:p>
       <w:pPr>
@@ -1076,24 +1022,13 @@
         </w:rPr>
         <w:t xml:space="preserve">FBref's advanced statistics </w:t>
       </w:r>
-      <w:del w:id="9002" w:author="Claude" w:date="2026-09-11T21:00:07Z">
-        <w:r>
-          <w:rPr>
-            <w:sz w:val="22"/>
-            <w:szCs w:val="22"/>
-          </w:rPr>
-          <w:delText xml:space="preserve">are supplied by StatsBomb</w:delText>
-        </w:r>
-      </w:del>
-      <w:ins w:id="9003" w:author="Claude" w:date="2026-09-11T21:00:07Z">
-        <w:r>
-          <w:rPr>
-            <w:sz w:val="22"/>
-            <w:szCs w:val="22"/>
-          </w:rPr>
-          <w:t xml:space="preserve">were supplied by Opta (Stats Perform)</w:t>
-        </w:r>
-      </w:ins>
+      <w:r>
+        <w:rPr>
+          <w:sz w:val="22"/>
+          <w:szCs w:val="22"/>
+        </w:rPr>
+        <w:t xml:space="preserve">were supplied by Opta (Stats Perform)</w:t>
+      </w:r>
       <w:r>
         <w:rPr>
           <w:sz w:val="22"/>
@@ -1125,83 +1060,6 @@
         </w:rPr>
         <w:t xml:space="preserve">Understat offers xG back to 2014/15 and was considered. It was rejected because it is shot-based only: it would have improved coverage for forwards while leaving defenders just as poorly measured. That buys three extra years at the direct cost of the project's central methodological idea.</w:t>
       </w:r>
-    </w:p>
-    <w:p>
-      <w:pPr>
-        <w:spacing w:after="140"/>
-        <w:rPr>
-          <w:ins w:id="9004" w:author="Claude" w:date="2026-09-11T21:00:07Z"/>
-        </w:rPr>
-      </w:pPr>
-      <w:ins w:id="9005" w:author="Claude" w:date="2026-09-11T21:00:07Z">
-        <w:r>
-          <w:rPr>
-            <w:b/>
-            <w:bCs/>
-            <w:sz w:val="22"/>
-            <w:szCs w:val="22"/>
-          </w:rPr>
-          <w:t xml:space="preserve">Why the window ends at 2023/24. </w:t>
-        </w:r>
-        <w:r>
-          <w:rPr>
-            <w:sz w:val="22"/>
-            <w:szCs w:val="22"/>
-          </w:rPr>
-          <w:t xml:space="preserve">On 20 January 2026, Opta (Stats Perform) terminated FBref's access to its data, citing an unspecified breach of their agreement, and demanded the data's immediate deletion. Sports Reference complied, removing every Opta-sourced advanced statistic from FBref: xG and xAG, progressive passes and carries, advanced defensive actions, and shot- and goal-creating actions. The removal covers past seasons as well as new ones. Basic statistics such as minutes, goals, assists and cards remain [1][2]. Sports Reference has said some advanced data may return in future, but "at a dramatically smaller scale" [1]. The gap is therefore current rather than necessarily permanent, and any data that does return would need to match the snapshot described below before this project used it.</w:t>
-        </w:r>
-      </w:ins>
-    </w:p>
-    <w:p>
-      <w:pPr>
-        <w:spacing w:after="140"/>
-        <w:rPr>
-          <w:ins w:id="9006" w:author="Claude" w:date="2026-09-11T21:00:07Z"/>
-        </w:rPr>
-      </w:pPr>
-      <w:ins w:id="9007" w:author="Claude" w:date="2026-09-11T21:00:07Z">
-        <w:r>
-          <w:rPr>
-            <w:sz w:val="22"/>
-            <w:szCs w:val="22"/>
-          </w:rPr>
-          <w:t xml:space="preserve">This project confirmed the removal directly. FBref's 2023/24 Big 5 player pages, fetched in September 2026, still list every player, but each advanced column is either blank for every player or gone from the table (docs/phase-1-scraper-diagnostics.md in the repository).</w:t>
-        </w:r>
-      </w:ins>
-    </w:p>
-    <w:p>
-      <w:pPr>
-        <w:spacing w:after="140"/>
-        <w:rPr>
-          <w:ins w:id="9008" w:author="Claude" w:date="2026-09-11T21:00:07Z"/>
-        </w:rPr>
-      </w:pPr>
-      <w:ins w:id="9009" w:author="Claude" w:date="2026-09-11T21:00:07Z">
-        <w:r>
-          <w:rPr>
-            <w:sz w:val="22"/>
-            <w:szCs w:val="22"/>
-          </w:rPr>
-          <w:t xml:space="preserve">The last complete public copy of the Opta-era data is the worldfootballR data repository, archived on 18 September 2025, four months before the removal. Its defensive, possession, aerial-duel and goalkeeping tables are complete through 2023/24 but hold only nine matchweeks of 2024/25. Scoring 2024/25 from part of a season would break the consistency this section is built on, so the scored window ends at 2023/24. Transfer activity after that is still shown on the club page, unscored (see 4.8).</w:t>
-        </w:r>
-      </w:ins>
-    </w:p>
-    <w:p>
-      <w:pPr>
-        <w:spacing w:after="140"/>
-        <w:rPr>
-          <w:ins w:id="9010" w:author="Claude" w:date="2026-09-11T21:00:07Z"/>
-        </w:rPr>
-      </w:pPr>
-      <w:ins w:id="9011" w:author="Claude" w:date="2026-09-11T21:00:07Z">
-        <w:r>
-          <w:rPr>
-            <w:sz w:val="22"/>
-            <w:szCs w:val="22"/>
-          </w:rPr>
-          <w:t xml:space="preserve">Sources: [1] Sean Forman (President, Sports Reference), "FBref &amp; Stathead Data Update", Sports-Reference.com blog, 20 January 2026, https://www.sports-reference.com/blog/2026/01/fbref-stathead-data-update/. [2] Catalina Bush, "FBref's loss of advanced stats is a blow to women's soccer data accessibility", The IX, 4 February 2026, https://www.theixsports.com/the-ix-soccer/fbrefs-loss-advanced-stats-womens-soccer-data-accessibility/.</w:t>
-        </w:r>
-      </w:ins>
     </w:p>
     <w:p>
       <w:pPr>
@@ -1211,6 +1069,63 @@
         <w:rPr>
           <w:b/>
           <w:bCs/>
+          <w:sz w:val="22"/>
+          <w:szCs w:val="22"/>
+        </w:rPr>
+        <w:t xml:space="preserve">Why the window ends at 2023/24. </w:t>
+      </w:r>
+      <w:r>
+        <w:rPr>
+          <w:sz w:val="22"/>
+          <w:szCs w:val="22"/>
+        </w:rPr>
+        <w:t xml:space="preserve">On 20 January 2026, Opta (Stats Perform) terminated FBref's access to its data, citing an unspecified breach of their agreement, and demanded the data's immediate deletion. Sports Reference complied, removing every Opta-sourced advanced statistic from FBref: xG and xAG, progressive passes and carries, advanced defensive actions, and shot- and goal-creating actions. The removal covers past seasons as well as new ones. Basic statistics such as minutes, goals, assists and cards remain [1][2]. Sports Reference has said some advanced data may return in future, but "at a dramatically smaller scale" [1]. The gap is therefore current rather than necessarily permanent, and any data that does return would need to match the snapshot described below before this project used it.</w:t>
+      </w:r>
+    </w:p>
+    <w:p>
+      <w:pPr>
+        <w:spacing w:after="140"/>
+      </w:pPr>
+      <w:r>
+        <w:rPr>
+          <w:sz w:val="22"/>
+          <w:szCs w:val="22"/>
+        </w:rPr>
+        <w:t xml:space="preserve">This project confirmed the removal directly. FBref's 2023/24 Big 5 player pages, fetched in September 2026, still list every player, but each advanced column is either blank for every player or gone from the table (docs/phase-1-scraper-diagnostics.md in the repository).</w:t>
+      </w:r>
+    </w:p>
+    <w:p>
+      <w:pPr>
+        <w:spacing w:after="140"/>
+      </w:pPr>
+      <w:r>
+        <w:rPr>
+          <w:sz w:val="22"/>
+          <w:szCs w:val="22"/>
+        </w:rPr>
+        <w:t xml:space="preserve">The last complete public copy of the Opta-era data is the worldfootballR data repository, archived on 18 September 2025, four months before the removal. Its defensive, possession, aerial-duel and goalkeeping tables are complete through 2023/24 but hold only nine matchweeks of 2024/25. Scoring 2024/25 from part of a season would break the consistency this section is built on, so the scored window ends at 2023/24. Transfer activity after that is still shown on the club page, unscored (see 4.8).</w:t>
+      </w:r>
+    </w:p>
+    <w:p>
+      <w:pPr>
+        <w:spacing w:after="140"/>
+      </w:pPr>
+      <w:r>
+        <w:rPr>
+          <w:sz w:val="22"/>
+          <w:szCs w:val="22"/>
+        </w:rPr>
+        <w:t xml:space="preserve">Sources: [1] Sean Forman (President, Sports Reference), "FBref &amp; Stathead Data Update", Sports-Reference.com blog, 20 January 2026, https://www.sports-reference.com/blog/2026/01/fbref-stathead-data-update/. [2] Catalina Bush, "FBref's loss of advanced stats is a blow to women's soccer data accessibility", The IX, 4 February 2026, https://www.theixsports.com/the-ix-soccer/fbrefs-loss-advanced-stats-womens-soccer-data-accessibility/.</w:t>
+      </w:r>
+    </w:p>
+    <w:p>
+      <w:pPr>
+        <w:spacing w:after="140"/>
+      </w:pPr>
+      <w:r>
+        <w:rPr>
+          <w:b/>
+          <w:bCs/>
           <w:i w:val="false"/>
           <w:iCs w:val="false"/>
           <w:sz w:val="22"/>
@@ -1218,32 +1133,6 @@
         </w:rPr>
         <w:t xml:space="preserve">Decision: </w:t>
       </w:r>
-      <w:del w:id="9012" w:author="Claude" w:date="2026-09-11T21:00:07Z">
-        <w:r>
-          <w:rPr>
-            <w:b w:val="false"/>
-            <w:bCs w:val="false"/>
-            <w:i w:val="false"/>
-            <w:iCs w:val="false"/>
-            <w:sz w:val="22"/>
-            <w:szCs w:val="22"/>
-          </w:rPr>
-          <w:delText xml:space="preserve">start at 2017/18. Nine seasons</w:delText>
-        </w:r>
-      </w:del>
-      <w:ins w:id="9013" w:author="Claude" w:date="2026-09-11T21:00:07Z">
-        <w:r>
-          <w:rPr>
-            <w:b w:val="false"/>
-            <w:bCs w:val="false"/>
-            <w:i w:val="false"/>
-            <w:iCs w:val="false"/>
-            <w:sz w:val="22"/>
-            <w:szCs w:val="22"/>
-          </w:rPr>
-          <w:t xml:space="preserve">start at 2017/18, end at 2023/24. Seven seasons</w:t>
-        </w:r>
-      </w:ins>
       <w:r>
         <w:rPr>
           <w:b w:val="false"/>
@@ -1253,6 +1142,17 @@
           <w:sz w:val="22"/>
           <w:szCs w:val="22"/>
         </w:rPr>
+        <w:t xml:space="preserve">start at 2017/18, end at 2023/24. Seven seasons</w:t>
+      </w:r>
+      <w:r>
+        <w:rPr>
+          <w:b w:val="false"/>
+          <w:bCs w:val="false"/>
+          <w:i w:val="false"/>
+          <w:iCs w:val="false"/>
+          <w:sz w:val="22"/>
+          <w:szCs w:val="22"/>
+        </w:rPr>
         <w:t xml:space="preserve">, one consistent data standard, no asterisk.</w:t>
       </w:r>
     </w:p>
@@ -1264,16 +1164,9 @@
       <w:r>
         <w:t xml:space="preserve">4.2  </w:t>
       </w:r>
-      <w:del w:id="9022" w:author="Claude" w:date="2026-09-11T21:20:49Z">
-        <w:r>
-          <w:delText xml:space="preserve">Why nine seasons</w:delText>
-        </w:r>
-      </w:del>
-      <w:ins w:id="9023" w:author="Claude" w:date="2026-09-11T21:20:49Z">
-        <w:r>
-          <w:t xml:space="preserve">Why seven seasons</w:t>
-        </w:r>
-      </w:ins>
+      <w:r>
+        <w:t xml:space="preserve">Why seven seasons</w:t>
+      </w:r>
       <w:r>
         <w:t xml:space="preserve"> rather than five</w:t>
       </w:r>
@@ -1289,15 +1182,13 @@
         </w:rPr>
         <w:t xml:space="preserve">An earlier draft scoped five seasons and excluded the COVID-affected period entirely. That was reconsidered.</w:t>
       </w:r>
-      <w:ins w:id="9024" w:author="Claude" w:date="2026-09-11T21:20:49Z">
-        <w:r>
-          <w:rPr>
-            <w:sz w:val="22"/>
-            <w:szCs w:val="22"/>
-          </w:rPr>
-          <w:t xml:space="preserve"> The window was then set at nine seasons; the loss of FBref's advanced data (4.1) later fixed it at seven.</w:t>
-        </w:r>
-      </w:ins>
+      <w:r>
+        <w:rPr>
+          <w:sz w:val="22"/>
+          <w:szCs w:val="22"/>
+        </w:rPr>
+        <w:t xml:space="preserve"> The window was then set at nine seasons; the loss of FBref's advanced data (4.1) later fixed it at seven.</w:t>
+      </w:r>
     </w:p>
     <w:p>
       <w:pPr>
@@ -1310,24 +1201,13 @@
         </w:rPr>
         <w:t xml:space="preserve">The transfer market's COVID distortion was concentrated in the summer 2020 and summer 2021 windows, when spending fell roughly 40% and had not fully recovered. In a five-season window that period is 20% of the data and a genuine problem. </w:t>
       </w:r>
-      <w:del w:id="9025" w:author="Claude" w:date="2026-09-11T21:20:49Z">
-        <w:r>
-          <w:rPr>
-            <w:sz w:val="22"/>
-            <w:szCs w:val="22"/>
-          </w:rPr>
-          <w:delText xml:space="preserve">In a nine-season window it is a controllable effect</w:delText>
-        </w:r>
-      </w:del>
-      <w:ins w:id="9026" w:author="Claude" w:date="2026-09-11T21:20:49Z">
-        <w:r>
-          <w:rPr>
-            <w:sz w:val="22"/>
-            <w:szCs w:val="22"/>
-          </w:rPr>
-          <w:t xml:space="preserve">In a seven-season window it is a smaller, controllable effect</w:t>
-        </w:r>
-      </w:ins>
+      <w:r>
+        <w:rPr>
+          <w:sz w:val="22"/>
+          <w:szCs w:val="22"/>
+        </w:rPr>
+        <w:t xml:space="preserve">In a seven-season window it is a smaller, controllable effect</w:t>
+      </w:r>
       <w:r>
         <w:rPr>
           <w:sz w:val="22"/>
@@ -1340,24 +1220,13 @@
       <w:pPr>
         <w:spacing w:after="140"/>
       </w:pPr>
-      <w:del w:id="9027" w:author="Claude" w:date="2026-09-11T21:20:49Z">
-        <w:r>
-          <w:rPr>
-            <w:sz w:val="22"/>
-            <w:szCs w:val="22"/>
-          </w:rPr>
-          <w:delText xml:space="preserve">Nine seasons also spans</w:delText>
-        </w:r>
-      </w:del>
-      <w:ins w:id="9028" w:author="Claude" w:date="2026-09-11T21:20:49Z">
-        <w:r>
-          <w:rPr>
-            <w:sz w:val="22"/>
-            <w:szCs w:val="22"/>
-          </w:rPr>
-          <w:t xml:space="preserve">Seven seasons still spans</w:t>
-        </w:r>
-      </w:ins>
+      <w:r>
+        <w:rPr>
+          <w:sz w:val="22"/>
+          <w:szCs w:val="22"/>
+        </w:rPr>
+        <w:t xml:space="preserve">Seven seasons still spans</w:t>
+      </w:r>
       <w:r>
         <w:rPr>
           <w:sz w:val="22"/>
@@ -1390,32 +1259,6 @@
         </w:rPr>
         <w:t xml:space="preserve">The risk of a </w:t>
       </w:r>
-      <w:del w:id="9029" w:author="Claude" w:date="2026-09-11T21:20:49Z">
-        <w:r>
-          <w:rPr>
-            <w:b w:val="false"/>
-            <w:bCs w:val="false"/>
-            <w:i w:val="false"/>
-            <w:iCs w:val="false"/>
-            <w:sz w:val="22"/>
-            <w:szCs w:val="22"/>
-          </w:rPr>
-          <w:delText xml:space="preserve">nine-year window</w:delText>
-        </w:r>
-      </w:del>
-      <w:ins w:id="9030" w:author="Claude" w:date="2026-09-11T21:20:49Z">
-        <w:r>
-          <w:rPr>
-            <w:b w:val="false"/>
-            <w:bCs w:val="false"/>
-            <w:i w:val="false"/>
-            <w:iCs w:val="false"/>
-            <w:sz w:val="22"/>
-            <w:szCs w:val="22"/>
-          </w:rPr>
-          <w:t xml:space="preserve">seven-year window</w:t>
-        </w:r>
-      </w:ins>
       <w:r>
         <w:rPr>
           <w:b w:val="false"/>
@@ -1425,6 +1268,17 @@
           <w:sz w:val="22"/>
           <w:szCs w:val="22"/>
         </w:rPr>
+        <w:t xml:space="preserve">seven-year window</w:t>
+      </w:r>
+      <w:r>
+        <w:rPr>
+          <w:b w:val="false"/>
+          <w:bCs w:val="false"/>
+          <w:i w:val="false"/>
+          <w:iCs w:val="false"/>
+          <w:sz w:val="22"/>
+          <w:szCs w:val="22"/>
+        </w:rPr>
         <w:t xml:space="preserve"> is </w:t>
       </w:r>
       <w:r>
@@ -1487,32 +1341,6 @@
         </w:rPr>
         <w:t xml:space="preserve">. Newcastle in 2017 and </w:t>
       </w:r>
-      <w:del w:id="9031" w:author="Claude" w:date="2026-09-11T21:20:49Z">
-        <w:r>
-          <w:rPr>
-            <w:b w:val="false"/>
-            <w:bCs w:val="false"/>
-            <w:i w:val="false"/>
-            <w:iCs w:val="false"/>
-            <w:sz w:val="22"/>
-            <w:szCs w:val="22"/>
-          </w:rPr>
-          <w:delText xml:space="preserve">Newcastle in 2025</w:delText>
-        </w:r>
-      </w:del>
-      <w:ins w:id="9032" w:author="Claude" w:date="2026-09-11T21:20:49Z">
-        <w:r>
-          <w:rPr>
-            <w:b w:val="false"/>
-            <w:bCs w:val="false"/>
-            <w:i w:val="false"/>
-            <w:iCs w:val="false"/>
-            <w:sz w:val="22"/>
-            <w:szCs w:val="22"/>
-          </w:rPr>
-          <w:t xml:space="preserve">Newcastle in 2024</w:t>
-        </w:r>
-      </w:ins>
       <w:r>
         <w:rPr>
           <w:b w:val="false"/>
@@ -1522,34 +1350,8 @@
           <w:sz w:val="22"/>
           <w:szCs w:val="22"/>
         </w:rPr>
-        <w:t xml:space="preserve"> are different organizations with different owners, budgets and strategies. Chelsea before and after the Boehly takeover are barely comparable entities. </w:t>
-      </w:r>
-      <w:del w:id="9033" w:author="Claude" w:date="2026-09-11T21:20:49Z">
-        <w:r>
-          <w:rPr>
-            <w:b w:val="false"/>
-            <w:bCs w:val="false"/>
-            <w:i w:val="false"/>
-            <w:iCs w:val="false"/>
-            <w:sz w:val="22"/>
-            <w:szCs w:val="22"/>
-          </w:rPr>
-          <w:delText xml:space="preserve">Collapsing nine years</w:delText>
-        </w:r>
-      </w:del>
-      <w:ins w:id="9034" w:author="Claude" w:date="2026-09-11T21:20:49Z">
-        <w:r>
-          <w:rPr>
-            <w:b w:val="false"/>
-            <w:bCs w:val="false"/>
-            <w:i w:val="false"/>
-            <w:iCs w:val="false"/>
-            <w:sz w:val="22"/>
-            <w:szCs w:val="22"/>
-          </w:rPr>
-          <w:t xml:space="preserve">Collapsing seven years</w:t>
-        </w:r>
-      </w:ins>
+        <w:t xml:space="preserve">Newcastle in 2024</w:t>
+      </w:r>
       <w:r>
         <w:rPr>
           <w:b w:val="false"/>
@@ -1559,6 +1361,28 @@
           <w:sz w:val="22"/>
           <w:szCs w:val="22"/>
         </w:rPr>
+        <w:t xml:space="preserve"> are different organizations with different owners, budgets and strategies. Chelsea before and after the Boehly takeover are barely comparable entities. </w:t>
+      </w:r>
+      <w:r>
+        <w:rPr>
+          <w:b w:val="false"/>
+          <w:bCs w:val="false"/>
+          <w:i w:val="false"/>
+          <w:iCs w:val="false"/>
+          <w:sz w:val="22"/>
+          <w:szCs w:val="22"/>
+        </w:rPr>
+        <w:t xml:space="preserve">Collapsing seven years</w:t>
+      </w:r>
+      <w:r>
+        <w:rPr>
+          <w:b w:val="false"/>
+          <w:bCs w:val="false"/>
+          <w:i w:val="false"/>
+          <w:iCs w:val="false"/>
+          <w:sz w:val="22"/>
+          <w:szCs w:val="22"/>
+        </w:rPr>
         <w:t xml:space="preserve"> into a single average can blend two genuinely different clubs into a meaningless middle number.</w:t>
       </w:r>
     </w:p>
@@ -1588,32 +1412,6 @@
         </w:rPr>
         <w:t xml:space="preserve">efficiency is computed per club per season, and reported as a trend, not only as a </w:t>
       </w:r>
-      <w:del w:id="9035" w:author="Claude" w:date="2026-09-11T21:20:49Z">
-        <w:r>
-          <w:rPr>
-            <w:b w:val="false"/>
-            <w:bCs w:val="false"/>
-            <w:i w:val="false"/>
-            <w:iCs w:val="false"/>
-            <w:sz w:val="22"/>
-            <w:szCs w:val="22"/>
-          </w:rPr>
-          <w:delText xml:space="preserve">nine-year aggregate</w:delText>
-        </w:r>
-      </w:del>
-      <w:ins w:id="9036" w:author="Claude" w:date="2026-09-11T21:20:49Z">
-        <w:r>
-          <w:rPr>
-            <w:b w:val="false"/>
-            <w:bCs w:val="false"/>
-            <w:i w:val="false"/>
-            <w:iCs w:val="false"/>
-            <w:sz w:val="22"/>
-            <w:szCs w:val="22"/>
-          </w:rPr>
-          <w:t xml:space="preserve">seven-year aggregate</w:t>
-        </w:r>
-      </w:ins>
       <w:r>
         <w:rPr>
           <w:b w:val="false"/>
@@ -1623,34 +1421,30 @@
           <w:sz w:val="22"/>
           <w:szCs w:val="22"/>
         </w:rPr>
+        <w:t xml:space="preserve">seven-year aggregate</w:t>
+      </w:r>
+      <w:r>
+        <w:rPr>
+          <w:b w:val="false"/>
+          <w:bCs w:val="false"/>
+          <w:i w:val="false"/>
+          <w:iCs w:val="false"/>
+          <w:sz w:val="22"/>
+          <w:szCs w:val="22"/>
+        </w:rPr>
         <w:t xml:space="preserve">. Season filters let a reader </w:t>
       </w:r>
-      <w:del w:id="9037" w:author="Claude" w:date="2026-09-11T21:20:49Z">
-        <w:r>
-          <w:rPr>
-            <w:b w:val="false"/>
-            <w:bCs w:val="false"/>
-            <w:i w:val="false"/>
-            <w:iCs w:val="false"/>
-            <w:sz w:val="22"/>
-            <w:szCs w:val="22"/>
-          </w:rPr>
-          <w:delText xml:space="preserve">compare 2017–2021 against 2022–2026 directly</w:delText>
-        </w:r>
-      </w:del>
-      <w:ins w:id="9038" w:author="Claude" w:date="2026-09-11T21:20:49Z">
-        <w:r>
-          <w:rPr>
-            <w:b w:val="false"/>
-            <w:bCs w:val="false"/>
-            <w:i w:val="false"/>
-            <w:iCs w:val="false"/>
-            <w:sz w:val="22"/>
-            <w:szCs w:val="22"/>
-          </w:rPr>
-          <w:t xml:space="preserve">compare 2017/18–2020/21 against 2021/22–2023/24 directly</w:t>
-        </w:r>
-      </w:ins>
+      <w:r>
+        <w:rPr>
+          <w:b w:val="false"/>
+          <w:bCs w:val="false"/>
+          <w:i w:val="false"/>
+          <w:iCs w:val="false"/>
+          <w:sz w:val="22"/>
+          <w:szCs w:val="22"/>
+        </w:rPr>
+        <w:t xml:space="preserve">compare 2017/18–2020/21 against 2021/22–2023/24 directly</w:t>
+      </w:r>
       <w:r>
         <w:rPr>
           <w:b w:val="false"/>
@@ -2256,24 +2050,13 @@
         </w:rPr>
         <w:t xml:space="preserve">They are excluded initially because wage data requires an additional and less reliable scraping source, and because fee data alone is complete and consistent </w:t>
       </w:r>
-      <w:del w:id="9043" w:author="Claude" w:date="2026-09-11T21:20:49Z">
-        <w:r>
-          <w:rPr>
-            <w:sz w:val="22"/>
-            <w:szCs w:val="22"/>
-          </w:rPr>
-          <w:delText xml:space="preserve">across all nine seasons</w:delText>
-        </w:r>
-      </w:del>
-      <w:ins w:id="9044" w:author="Claude" w:date="2026-09-11T21:20:49Z">
-        <w:r>
-          <w:rPr>
-            <w:sz w:val="22"/>
-            <w:szCs w:val="22"/>
-          </w:rPr>
-          <w:t xml:space="preserve">across all seven seasons</w:t>
-        </w:r>
-      </w:ins>
+      <w:r>
+        <w:rPr>
+          <w:sz w:val="22"/>
+          <w:szCs w:val="22"/>
+        </w:rPr>
+        <w:t xml:space="preserve">across all seven seasons</w:t>
+      </w:r>
       <w:r>
         <w:rPr>
           <w:sz w:val="22"/>
@@ -2317,16 +2100,9 @@
       <w:r>
         <w:t xml:space="preserve">4.8  Why </w:t>
       </w:r>
-      <w:del w:id="9054" w:author="Claude" w:date="2026-09-11T21:26:05Z">
-        <w:r>
-          <w:delText xml:space="preserve">the 2026/27 window is</w:delText>
-        </w:r>
-      </w:del>
-      <w:ins w:id="9055" w:author="Claude" w:date="2026-09-11T21:26:05Z">
-        <w:r>
-          <w:t xml:space="preserve">transfers after 2023/24 are</w:t>
-        </w:r>
-      </w:ins>
+      <w:r>
+        <w:t xml:space="preserve">transfers after 2023/24 are</w:t>
+      </w:r>
       <w:r>
         <w:t xml:space="preserve"> shown but not scored</w:t>
       </w:r>
@@ -2334,79 +2110,13 @@
     <w:p>
       <w:pPr>
         <w:spacing w:after="140"/>
-        <w:rPr>
-          <w:ins w:id="9056" w:author="Claude" w:date="2026-09-11T21:26:05Z"/>
-        </w:rPr>
-      </w:pPr>
-      <w:ins w:id="9057" w:author="Claude" w:date="2026-09-11T21:26:05Z">
-        <w:r>
-          <w:rPr>
-            <w:sz w:val="22"/>
-            <w:szCs w:val="22"/>
-          </w:rPr>
-          <w:t xml:space="preserve">Three seasons of transfer activity fall after the scored window: 2024/25, 2025/26 and 2026/27. All three appear on the club page and none is scored, for two different reasons.</w:t>
-        </w:r>
-      </w:ins>
-    </w:p>
-    <w:p>
-      <w:pPr>
-        <w:spacing w:after="140"/>
-        <w:rPr>
-          <w:ins w:id="9058" w:author="Claude" w:date="2026-09-11T21:26:05Z"/>
-        </w:rPr>
-      </w:pPr>
-      <w:ins w:id="9059" w:author="Claude" w:date="2026-09-11T21:26:05Z">
-        <w:r>
-          <w:rPr>
-            <w:b/>
-            <w:bCs/>
-            <w:sz w:val="22"/>
-            <w:szCs w:val="22"/>
-          </w:rPr>
-          <w:t xml:space="preserve">2024/25 and 2025/26: the output data isn't available. </w:t>
-        </w:r>
-        <w:r>
-          <w:rPr>
-            <w:sz w:val="22"/>
-            <w:szCs w:val="22"/>
-          </w:rPr>
-          <w:t xml:space="preserve">Both seasons have been played in full, and their transfer fees are known. What's missing is on-field output measured on the same basis as the scored seasons. FBref's Opta-sourced advanced statistics were removed in January 2026 (4.1), and the last complete copy stops partway through: its defensive, possession, aerial-duel and goalkeeping data cover only nine matchweeks of 2024/25 and none of 2025/26. Scoring these seasons anyway would mean judging their signings on fewer metrics than every earlier season, or on another provider's data, putting a break in the trend at exactly the point the "who got smarter" question looks at. The limit is the data, not how recent the signings are.</w:t>
-        </w:r>
-      </w:ins>
-    </w:p>
-    <w:p>
-      <w:pPr>
-        <w:spacing w:after="140"/>
-      </w:pPr>
-      <w:ins w:id="9060" w:author="Claude" w:date="2026-09-11T21:26:05Z">
-        <w:r>
-          <w:rPr>
-            <w:b/>
-            <w:bCs/>
-            <w:sz w:val="22"/>
-            <w:szCs w:val="22"/>
-          </w:rPr>
-          <w:t xml:space="preserve">2026/27: too new to score. </w:t>
-        </w:r>
-      </w:ins>
-      <w:r>
-        <w:rPr>
-          <w:sz w:val="22"/>
-          <w:szCs w:val="22"/>
-        </w:rPr>
-        <w:t xml:space="preserve">The summer 2026 window has closed, so spending is fully known. But those signings have played only a handful of matches.</w:t>
-      </w:r>
-    </w:p>
-    <w:p>
-      <w:pPr>
-        <w:spacing w:after="140"/>
-      </w:pPr>
-      <w:r>
-        <w:rPr>
-          <w:sz w:val="22"/>
-          <w:szCs w:val="22"/>
-        </w:rPr>
-        <w:t xml:space="preserve">Scoring them would penalize every club that spent this summer, purely because the season is young — a distortion any informed reader would immediately spot.</w:t>
+      </w:pPr>
+      <w:r>
+        <w:rPr>
+          <w:sz w:val="22"/>
+          <w:szCs w:val="22"/>
+        </w:rPr>
+        <w:t xml:space="preserve">Three seasons of transfer activity fall after the scored window: 2024/25, 2025/26 and 2026/27. All three appear on the club page and none is scored, for two different reasons.</w:t>
       </w:r>
     </w:p>
     <w:p>
@@ -2417,6 +2127,60 @@
         <w:rPr>
           <w:b/>
           <w:bCs/>
+          <w:sz w:val="22"/>
+          <w:szCs w:val="22"/>
+        </w:rPr>
+        <w:t xml:space="preserve">2024/25 and 2025/26: the output data isn't available. </w:t>
+      </w:r>
+      <w:r>
+        <w:rPr>
+          <w:sz w:val="22"/>
+          <w:szCs w:val="22"/>
+        </w:rPr>
+        <w:t xml:space="preserve">Both seasons have been played in full, and their transfer fees are known. What's missing is on-field output measured on the same basis as the scored seasons. FBref's Opta-sourced advanced statistics were removed in January 2026 (4.1), and the last complete copy stops partway through: its defensive, possession, aerial-duel and goalkeeping data cover only nine matchweeks of 2024/25 and none of 2025/26. Scoring these seasons anyway would mean judging their signings on fewer metrics than every earlier season, or on another provider's data, putting a break in the trend at exactly the point the "who got smarter" question looks at. The limit is the data, not how recent the signings are.</w:t>
+      </w:r>
+    </w:p>
+    <w:p>
+      <w:pPr>
+        <w:spacing w:after="140"/>
+      </w:pPr>
+      <w:r>
+        <w:rPr>
+          <w:b/>
+          <w:bCs/>
+          <w:sz w:val="22"/>
+          <w:szCs w:val="22"/>
+        </w:rPr>
+        <w:t xml:space="preserve">2026/27: too new to score. </w:t>
+      </w:r>
+      <w:r>
+        <w:rPr>
+          <w:sz w:val="22"/>
+          <w:szCs w:val="22"/>
+        </w:rPr>
+        <w:t xml:space="preserve">The summer 2026 window has closed, so spending is fully known. But those signings have played only a handful of matches.</w:t>
+      </w:r>
+    </w:p>
+    <w:p>
+      <w:pPr>
+        <w:spacing w:after="140"/>
+      </w:pPr>
+      <w:r>
+        <w:rPr>
+          <w:sz w:val="22"/>
+          <w:szCs w:val="22"/>
+        </w:rPr>
+        <w:t xml:space="preserve">Scoring them would penalize every club that spent this summer, purely because the season is young — a distortion any informed reader would immediately spot.</w:t>
+      </w:r>
+    </w:p>
+    <w:p>
+      <w:pPr>
+        <w:spacing w:after="140"/>
+      </w:pPr>
+      <w:r>
+        <w:rPr>
+          <w:b/>
+          <w:bCs/>
           <w:i w:val="false"/>
           <w:iCs w:val="false"/>
           <w:sz w:val="22"/>
@@ -2424,32 +2188,17 @@
         </w:rPr>
         <w:t xml:space="preserve">Approach: </w:t>
       </w:r>
-      <w:del w:id="9061" w:author="Claude" w:date="2026-09-11T21:26:05Z">
-        <w:r>
-          <w:rPr>
-            <w:b w:val="false"/>
-            <w:bCs w:val="false"/>
-            <w:i w:val="false"/>
-            <w:iCs w:val="false"/>
-            <w:sz w:val="22"/>
-            <w:szCs w:val="22"/>
-          </w:rPr>
-          <w:delText xml:space="preserve">the 2026/27 window appears on the club page as a recency layer showing what each club just did, clearly flagged as too new to score.</w:delText>
-        </w:r>
-      </w:del>
-      <w:ins w:id="9062" w:author="Claude" w:date="2026-09-11T21:26:05Z">
-        <w:r>
-          <w:rPr>
-            <w:b w:val="false"/>
-            <w:bCs w:val="false"/>
-            <w:i w:val="false"/>
-            <w:iCs w:val="false"/>
-            <w:sz w:val="22"/>
-            <w:szCs w:val="22"/>
-          </w:rPr>
-          <w:t xml:space="preserve">all three seasons appear on the club page as a recency layer showing what each club spent and received, clearly flagged as unscored, with the reason: output data unavailable for 2024/25 and 2025/26, too early to judge for 2026/27. If comparable advanced data becomes available again (4.1), 2024/25 and 2025/26 are the first candidates to join the scored window, once that data has passed the same overlap test as every other source.</w:t>
-        </w:r>
-      </w:ins>
+      <w:r>
+        <w:rPr>
+          <w:b w:val="false"/>
+          <w:bCs w:val="false"/>
+          <w:i w:val="false"/>
+          <w:iCs w:val="false"/>
+          <w:sz w:val="22"/>
+          <w:szCs w:val="22"/>
+        </w:rPr>
+        <w:t xml:space="preserve">all three seasons appear on the club page as a recency layer showing what each club spent and received, clearly flagged as unscored, with the reason: output data unavailable for 2024/25 and 2025/26, too early to judge for 2026/27. If comparable advanced data becomes available again (4.1), 2024/25 and 2025/26 are the first candidates to join the scored window, once that data has passed the same overlap test as every other source.</w:t>
+      </w:r>
     </w:p>
     <w:p>
       <w:pPr>
@@ -2471,24 +2220,13 @@
         </w:rPr>
         <w:t xml:space="preserve">Because efficiency is tracked </w:t>
       </w:r>
-      <w:del w:id="9039" w:author="Claude" w:date="2026-09-11T21:20:49Z">
-        <w:r>
-          <w:rPr>
-            <w:sz w:val="22"/>
-            <w:szCs w:val="22"/>
-          </w:rPr>
-          <w:delText xml:space="preserve">over nine seasons</w:delText>
-        </w:r>
-      </w:del>
-      <w:ins w:id="9040" w:author="Claude" w:date="2026-09-11T21:20:49Z">
-        <w:r>
-          <w:rPr>
-            <w:sz w:val="22"/>
-            <w:szCs w:val="22"/>
-          </w:rPr>
-          <w:t xml:space="preserve">over seven seasons</w:t>
-        </w:r>
-      </w:ins>
+      <w:r>
+        <w:rPr>
+          <w:sz w:val="22"/>
+          <w:szCs w:val="22"/>
+        </w:rPr>
+        <w:t xml:space="preserve">over seven seasons</w:t>
+      </w:r>
       <w:r>
         <w:rPr>
           <w:sz w:val="22"/>
@@ -2659,32 +2397,17 @@
         </w:rPr>
         <w:t xml:space="preserve">Data source: </w:t>
       </w:r>
-      <w:del w:id="9081" w:author="Claude" w:date="2026-09-11T22:04:37Z">
-        <w:r>
-          <w:rPr>
-            <w:b w:val="false"/>
-            <w:bCs w:val="false"/>
-            <w:i w:val="false"/>
-            <w:iCs w:val="false"/>
-            <w:sz w:val="22"/>
-            <w:szCs w:val="22"/>
-          </w:rPr>
-          <w:delText xml:space="preserve">worldfootballR's tm_team_staff_history() supplies manager tenures with dates, and tm_team_transfer_balances() supplies per-season fees paid and received. Both originate from Transfermarkt and join cleanly to data already being ingested.</w:delText>
-        </w:r>
-      </w:del>
-      <w:ins w:id="9082" w:author="Claude" w:date="2026-09-11T22:04:37Z">
-        <w:r>
-          <w:rPr>
-            <w:b w:val="false"/>
-            <w:bCs w:val="false"/>
-            <w:i w:val="false"/>
-            <w:iCs w:val="false"/>
-            <w:sz w:val="22"/>
-            <w:szCs w:val="22"/>
-          </w:rPr>
-          <w:t xml:space="preserve">transfermarkt-datasets, a CC0-licensed build of Transfermarkt data that stopped updating in July 2026, names the manager for every match. Tenure bands are built from those per-match names, caretakers included, and drawn against season boundaries as described above. There are no official appointment or departure dates and no manager IDs, so names are checked by hand for spelling variants. Per-season fees paid and received are summed from the same dataset's transfers; loan fees aren't included (see 7).</w:t>
-        </w:r>
-      </w:ins>
+      <w:r>
+        <w:rPr>
+          <w:b w:val="false"/>
+          <w:bCs w:val="false"/>
+          <w:i w:val="false"/>
+          <w:iCs w:val="false"/>
+          <w:sz w:val="22"/>
+          <w:szCs w:val="22"/>
+        </w:rPr>
+        <w:t xml:space="preserve">transfermarkt-datasets, a CC0-licensed build of Transfermarkt data that stopped updating in July 2026, names the manager for every match. Tenure bands are built from those per-match names, caretakers included, and drawn against season boundaries as described above. There are no official appointment or departure dates and no manager IDs, so names are checked by hand for spelling variants. Per-season fees paid and received are summed from the same dataset's transfers; loan fees aren't included (see 7).</w:t>
+      </w:r>
     </w:p>
     <w:p>
       <w:pPr>
@@ -3002,32 +2725,17 @@
         </w:rPr>
         <w:t xml:space="preserve">Rather than assigning weights by judgment, each pillar is regressed against actual sporting success </w:t>
       </w:r>
-      <w:del w:id="9041" w:author="Claude" w:date="2026-09-11T21:20:49Z">
-        <w:r>
-          <w:rPr>
-            <w:b w:val="false"/>
-            <w:bCs w:val="false"/>
-            <w:i w:val="false"/>
-            <w:iCs w:val="false"/>
-            <w:sz w:val="22"/>
-            <w:szCs w:val="22"/>
-          </w:rPr>
-          <w:delText xml:space="preserve">across the nine seasons</w:delText>
-        </w:r>
-      </w:del>
-      <w:ins w:id="9042" w:author="Claude" w:date="2026-09-11T21:20:49Z">
-        <w:r>
-          <w:rPr>
-            <w:b w:val="false"/>
-            <w:bCs w:val="false"/>
-            <w:i w:val="false"/>
-            <w:iCs w:val="false"/>
-            <w:sz w:val="22"/>
-            <w:szCs w:val="22"/>
-          </w:rPr>
-          <w:t xml:space="preserve">across the seven seasons</w:t>
-        </w:r>
-      </w:ins>
+      <w:r>
+        <w:rPr>
+          <w:b w:val="false"/>
+          <w:bCs w:val="false"/>
+          <w:i w:val="false"/>
+          <w:iCs w:val="false"/>
+          <w:sz w:val="22"/>
+          <w:szCs w:val="22"/>
+        </w:rPr>
+        <w:t xml:space="preserve">across the seven seasons</w:t>
+      </w:r>
       <w:r>
         <w:rPr>
           <w:b w:val="false"/>
@@ -3160,24 +2868,13 @@
       <w:pPr>
         <w:spacing w:after="140"/>
       </w:pPr>
-      <w:del w:id="9063" w:author="Claude" w:date="2026-09-11T21:26:05Z">
-        <w:r>
-          <w:rPr>
-            <w:sz w:val="22"/>
-            <w:szCs w:val="22"/>
-          </w:rPr>
-          <w:delText xml:space="preserve">Python for ingestion and modeling — the natural tool for scraping, reshaping and loading. R for the statistical layer, where the regression-derived weights are computed, and for worldfootballR's pre-built FBref-to-Transfermarkt player mapping. PostgreSQL as the warehouse, holding a proper star schema. Power BI for delivery.</w:delText>
-        </w:r>
-      </w:del>
-      <w:ins w:id="9064" w:author="Claude" w:date="2026-09-11T21:26:05Z">
-        <w:r>
-          <w:rPr>
-            <w:sz w:val="22"/>
-            <w:szCs w:val="22"/>
-          </w:rPr>
-          <w:t xml:space="preserve">Python for ingestion: downloading, checksumming, reshaping and loading. R for the statistical layer, where the regression-derived weights are computed, and for reading the FBref snapshot's native .rds files. PostgreSQL as the warehouse, holding a proper star schema. Power BI for delivery.</w:t>
-        </w:r>
-      </w:ins>
+      <w:r>
+        <w:rPr>
+          <w:sz w:val="22"/>
+          <w:szCs w:val="22"/>
+        </w:rPr>
+        <w:t xml:space="preserve">Python for ingestion: downloading, checksumming, reshaping and loading. R for the statistical layer, where the regression-derived weights are computed, and for reading the FBref snapshot's native .rds files. PostgreSQL as the warehouse, holding a proper star schema. Power BI for delivery.</w:t>
+      </w:r>
     </w:p>
     <w:p>
       <w:pPr>
@@ -3194,45 +2891,35 @@
     <w:p>
       <w:pPr>
         <w:spacing w:after="140"/>
-        <w:rPr>
-          <w:ins w:id="9065" w:author="Claude" w:date="2026-09-11T21:26:05Z"/>
-        </w:rPr>
-      </w:pPr>
-      <w:ins w:id="9066" w:author="Claude" w:date="2026-09-11T21:26:05Z">
-        <w:r>
-          <w:rPr>
-            <w:b/>
-            <w:bCs/>
-            <w:sz w:val="22"/>
-            <w:szCs w:val="22"/>
-          </w:rPr>
-          <w:t xml:space="preserve">FBref data is not scraped. </w:t>
-        </w:r>
-        <w:r>
-          <w:rPr>
-            <w:sz w:val="22"/>
-            <w:szCs w:val="22"/>
-          </w:rPr>
-          <w:t xml:space="preserve">FBref lost its Opta-sourced advanced statistics in January 2026 (4.1), so the pipeline reads a frozen copy instead: the worldfootballR data repository's season files, archived in September 2025 and held locally with a checksummed manifest, so every run uses identical data. Shot-creating actions come from a Kaggle copy of the same FBref data, validated against the snapshot. A browser-driven fetcher (seleniumbase's Pure CDP mode) was used once, to confirm on FBref's live pages that the advanced columns are blank; it stays in the repository as a record but isn't part of the pipeline.</w:t>
-        </w:r>
-      </w:ins>
-    </w:p>
-    <w:p>
-      <w:pPr>
-        <w:spacing w:after="140"/>
-        <w:rPr>
-          <w:ins w:id="9067" w:author="Claude" w:date="2026-09-11T21:26:05Z"/>
-        </w:rPr>
-      </w:pPr>
-      <w:ins w:id="9068" w:author="Claude" w:date="2026-09-11T21:26:05Z">
-        <w:r>
-          <w:rPr>
-            <w:sz w:val="22"/>
-            <w:szCs w:val="22"/>
-          </w:rPr>
-          <w:t xml:space="preserve">worldfootballR itself was archived in September 2025 and is no longer a live dependency. Its FBref-to-Transfermarkt player dictionary is used as a frozen file from the same repository. Transfermarkt data, including the manager named for every match, comes from transfermarkt-datasets, a CC0-licensed build that stopped updating in July 2026.</w:t>
-        </w:r>
-      </w:ins>
+      </w:pPr>
+      <w:r>
+        <w:rPr>
+          <w:b/>
+          <w:bCs/>
+          <w:sz w:val="22"/>
+          <w:szCs w:val="22"/>
+        </w:rPr>
+        <w:t xml:space="preserve">FBref data is not scraped. </w:t>
+      </w:r>
+      <w:r>
+        <w:rPr>
+          <w:sz w:val="22"/>
+          <w:szCs w:val="22"/>
+        </w:rPr>
+        <w:t xml:space="preserve">FBref lost its Opta-sourced advanced statistics in January 2026 (4.1), so the pipeline reads a frozen copy instead: the worldfootballR data repository's season files, archived in September 2025 and held locally with a checksummed manifest, so every run uses identical data. Shot-creating actions come from a Kaggle copy of the same FBref data, validated against the snapshot. A browser-driven fetcher (seleniumbase's Pure CDP mode) was used once, to confirm on FBref's live pages that the advanced columns are blank; it stays in the repository as a record but isn't part of the pipeline.</w:t>
+      </w:r>
+    </w:p>
+    <w:p>
+      <w:pPr>
+        <w:spacing w:after="140"/>
+      </w:pPr>
+      <w:r>
+        <w:rPr>
+          <w:sz w:val="22"/>
+          <w:szCs w:val="22"/>
+        </w:rPr>
+        <w:t xml:space="preserve">worldfootballR itself was archived in September 2025 and is no longer a live dependency. Its FBref-to-Transfermarkt player dictionary is used as a frozen file from the same repository. Transfermarkt data, including the manager named for every match, comes from transfermarkt-datasets, a CC0-licensed build that stopped updating in July 2026.</w:t>
+      </w:r>
     </w:p>
     <w:tbl>
       <w:tblPr>
@@ -3362,28 +3049,15 @@
             </w:tcMar>
           </w:tcPr>
           <w:p>
-            <w:del w:id="9069" w:author="Claude" w:date="2026-09-11T21:26:05Z">
-              <w:r>
-                <w:rPr>
-                  <w:b w:val="false"/>
-                  <w:bCs w:val="false"/>
-                  <w:sz w:val="20"/>
-                  <w:szCs w:val="20"/>
-                </w:rPr>
-                <w:delText xml:space="preserve">Python</w:delText>
-              </w:r>
-            </w:del>
-            <w:ins w:id="9070" w:author="Claude" w:date="2026-09-11T21:26:05Z">
-              <w:r>
-                <w:rPr>
-                  <w:b w:val="false"/>
-                  <w:bCs w:val="false"/>
-                  <w:sz w:val="20"/>
-                  <w:szCs w:val="20"/>
-                </w:rPr>
-                <w:t xml:space="preserve">Python, with base R for .rds conversion</w:t>
-              </w:r>
-            </w:ins>
+            <w:r>
+              <w:rPr>
+                <w:b w:val="false"/>
+                <w:bCs w:val="false"/>
+                <w:sz w:val="20"/>
+                <w:szCs w:val="20"/>
+              </w:rPr>
+              <w:t xml:space="preserve">Python, with base R for .rds conversion</w:t>
+            </w:r>
           </w:p>
         </w:tc>
         <w:tc>
@@ -3397,28 +3071,15 @@
             </w:tcMar>
           </w:tcPr>
           <w:p>
-            <w:del w:id="9071" w:author="Claude" w:date="2026-09-11T21:26:05Z">
-              <w:r>
-                <w:rPr>
-                  <w:b w:val="false"/>
-                  <w:bCs w:val="false"/>
-                  <w:sz w:val="20"/>
-                  <w:szCs w:val="20"/>
-                </w:rPr>
-                <w:delText xml:space="preserve">Scrape and reshape Transfermarkt and FBref data</w:delText>
-              </w:r>
-            </w:del>
-            <w:ins w:id="9072" w:author="Claude" w:date="2026-09-11T21:26:05Z">
-              <w:r>
-                <w:rPr>
-                  <w:b w:val="false"/>
-                  <w:bCs w:val="false"/>
-                  <w:sz w:val="20"/>
-                  <w:szCs w:val="20"/>
-                </w:rPr>
-                <w:t xml:space="preserve">Freeze the FBref snapshot and Kaggle file with checksums; ingest Transfermarkt data from transfermarkt-datasets; reshape and load into PostgreSQL</w:t>
-              </w:r>
-            </w:ins>
+            <w:r>
+              <w:rPr>
+                <w:b w:val="false"/>
+                <w:bCs w:val="false"/>
+                <w:sz w:val="20"/>
+                <w:szCs w:val="20"/>
+              </w:rPr>
+              <w:t xml:space="preserve">Freeze the FBref snapshot and Kaggle file with checksums; ingest Transfermarkt data from transfermarkt-datasets; reshape and load into PostgreSQL</w:t>
+            </w:r>
           </w:p>
         </w:tc>
       </w:tr>
@@ -3459,28 +3120,15 @@
             </w:tcMar>
           </w:tcPr>
           <w:p>
-            <w:del w:id="9073" w:author="Claude" w:date="2026-09-11T21:26:05Z">
-              <w:r>
-                <w:rPr>
-                  <w:b w:val="false"/>
-                  <w:bCs w:val="false"/>
-                  <w:sz w:val="20"/>
-                  <w:szCs w:val="20"/>
-                </w:rPr>
-                <w:delText xml:space="preserve">R (worldfootballR)</w:delText>
-              </w:r>
-            </w:del>
-            <w:ins w:id="9074" w:author="Claude" w:date="2026-09-11T21:26:05Z">
-              <w:r>
-                <w:rPr>
-                  <w:b w:val="false"/>
-                  <w:bCs w:val="false"/>
-                  <w:sz w:val="20"/>
-                  <w:szCs w:val="20"/>
-                </w:rPr>
-                <w:t xml:space="preserve">Frozen file + manual table</w:t>
-              </w:r>
-            </w:ins>
+            <w:r>
+              <w:rPr>
+                <w:b w:val="false"/>
+                <w:bCs w:val="false"/>
+                <w:sz w:val="20"/>
+                <w:szCs w:val="20"/>
+              </w:rPr>
+              <w:t xml:space="preserve">Frozen file + manual table</w:t>
+            </w:r>
           </w:p>
         </w:tc>
         <w:tc>
@@ -3494,28 +3142,15 @@
             </w:tcMar>
           </w:tcPr>
           <w:p>
-            <w:del w:id="9075" w:author="Claude" w:date="2026-09-11T21:26:05Z">
-              <w:r>
-                <w:rPr>
-                  <w:b w:val="false"/>
-                  <w:bCs w:val="false"/>
-                  <w:sz w:val="20"/>
-                  <w:szCs w:val="20"/>
-                </w:rPr>
-                <w:delText xml:space="preserve">Pre-built FBref ↔ Transfermarkt player dictionary</w:delText>
-              </w:r>
-            </w:del>
-            <w:ins w:id="9076" w:author="Claude" w:date="2026-09-11T21:26:05Z">
-              <w:r>
-                <w:rPr>
-                  <w:b w:val="false"/>
-                  <w:bCs w:val="false"/>
-                  <w:sz w:val="20"/>
-                  <w:szCs w:val="20"/>
-                </w:rPr>
-                <w:t xml:space="preserve">FBref ↔ Transfermarkt player dictionary, frozen from worldfootballR's repository; hand-built club table keyed on FBref team IDs</w:t>
-              </w:r>
-            </w:ins>
+            <w:r>
+              <w:rPr>
+                <w:b w:val="false"/>
+                <w:bCs w:val="false"/>
+                <w:sz w:val="20"/>
+                <w:szCs w:val="20"/>
+              </w:rPr>
+              <w:t xml:space="preserve">FBref ↔ Transfermarkt player dictionary, frozen from worldfootballR's repository; hand-built club table keyed on FBref team IDs</w:t>
+            </w:r>
           </w:p>
         </w:tc>
       </w:tr>
@@ -3556,28 +3191,15 @@
             </w:tcMar>
           </w:tcPr>
           <w:p>
-            <w:del w:id="9077" w:author="Claude" w:date="2026-09-11T21:26:05Z">
-              <w:r>
-                <w:rPr>
-                  <w:b w:val="false"/>
-                  <w:bCs w:val="false"/>
-                  <w:sz w:val="20"/>
-                  <w:szCs w:val="20"/>
-                </w:rPr>
-                <w:delText xml:space="preserve">R (worldfootballR)</w:delText>
-              </w:r>
-            </w:del>
-            <w:ins w:id="9078" w:author="Claude" w:date="2026-09-11T21:26:05Z">
-              <w:r>
-                <w:rPr>
-                  <w:b w:val="false"/>
-                  <w:bCs w:val="false"/>
-                  <w:sz w:val="20"/>
-                  <w:szCs w:val="20"/>
-                </w:rPr>
-                <w:t xml:space="preserve">Python (transfermarkt-datasets)</w:t>
-              </w:r>
-            </w:ins>
+            <w:r>
+              <w:rPr>
+                <w:b w:val="false"/>
+                <w:bCs w:val="false"/>
+                <w:sz w:val="20"/>
+                <w:szCs w:val="20"/>
+              </w:rPr>
+              <w:t xml:space="preserve">Python (transfermarkt-datasets)</w:t>
+            </w:r>
           </w:p>
         </w:tc>
         <w:tc>
@@ -3591,28 +3213,15 @@
             </w:tcMar>
           </w:tcPr>
           <w:p>
-            <w:del w:id="9079" w:author="Claude" w:date="2026-09-11T21:26:05Z">
-              <w:r>
-                <w:rPr>
-                  <w:b w:val="false"/>
-                  <w:bCs w:val="false"/>
-                  <w:sz w:val="20"/>
-                  <w:szCs w:val="20"/>
-                </w:rPr>
-                <w:delText xml:space="preserve">Coach appointment and departure dates per club</w:delText>
-              </w:r>
-            </w:del>
-            <w:ins w:id="9080" w:author="Claude" w:date="2026-09-11T21:26:05Z">
-              <w:r>
-                <w:rPr>
-                  <w:b w:val="false"/>
-                  <w:bCs w:val="false"/>
-                  <w:sz w:val="20"/>
-                  <w:szCs w:val="20"/>
-                </w:rPr>
-                <w:t xml:space="preserve">Tenure bands from the manager named for every match; no official appointment or departure dates</w:t>
-              </w:r>
-            </w:ins>
+            <w:r>
+              <w:rPr>
+                <w:b w:val="false"/>
+                <w:bCs w:val="false"/>
+                <w:sz w:val="20"/>
+                <w:szCs w:val="20"/>
+              </w:rPr>
+              <w:t xml:space="preserve">Tenure bands from the manager named for every match; no official appointment or departure dates</w:t>
+            </w:r>
           </w:p>
         </w:tc>
       </w:tr>
@@ -3976,17 +3585,15 @@
               </w:rPr>
               <w:t xml:space="preserve">Highest risk in the project. "Man Utd" / "Manchester United" / "Manchester Utd" all refer to one club. Projects like this commonly stall here</w:t>
             </w:r>
-            <w:ins w:id="9045" w:author="Claude" w:date="2026-09-11T21:20:49Z">
-              <w:r>
-                <w:rPr>
-                  <w:b w:val="false"/>
-                  <w:bCs w:val="false"/>
-                  <w:sz w:val="20"/>
-                  <w:szCs w:val="20"/>
-                </w:rPr>
-                <w:t xml:space="preserve">. Names change even within one source: FBref lists Borussia Mönchengladbach as "M'Gladbach", then "Gladbach", under the same team ID</w:t>
-              </w:r>
-            </w:ins>
+            <w:r>
+              <w:rPr>
+                <w:b w:val="false"/>
+                <w:bCs w:val="false"/>
+                <w:sz w:val="20"/>
+                <w:szCs w:val="20"/>
+              </w:rPr>
+              <w:t xml:space="preserve">. Names change even within one source: FBref lists Borussia Mönchengladbach as "M'Gladbach", then "Gladbach", under the same team ID</w:t>
+            </w:r>
           </w:p>
         </w:tc>
         <w:tc>
@@ -4009,28 +3616,15 @@
               </w:rPr>
               <w:t xml:space="preserve">worldfootballR's player dictionary handles players; </w:t>
             </w:r>
-            <w:del w:id="9046" w:author="Claude" w:date="2026-09-11T21:20:49Z">
-              <w:r>
-                <w:rPr>
-                  <w:b w:val="false"/>
-                  <w:bCs w:val="false"/>
-                  <w:sz w:val="20"/>
-                  <w:szCs w:val="20"/>
-                </w:rPr>
-                <w:delText xml:space="preserve">a manual club mapping table handles clubs</w:delText>
-              </w:r>
-            </w:del>
-            <w:ins w:id="9047" w:author="Claude" w:date="2026-09-11T21:20:49Z">
-              <w:r>
-                <w:rPr>
-                  <w:b w:val="false"/>
-                  <w:bCs w:val="false"/>
-                  <w:sz w:val="20"/>
-                  <w:szCs w:val="20"/>
-                </w:rPr>
-                <w:t xml:space="preserve">a manual club mapping table, keyed on FBref team IDs rather than names, handles clubs</w:t>
-              </w:r>
-            </w:ins>
+            <w:r>
+              <w:rPr>
+                <w:b w:val="false"/>
+                <w:bCs w:val="false"/>
+                <w:sz w:val="20"/>
+                <w:szCs w:val="20"/>
+              </w:rPr>
+              <w:t xml:space="preserve">a manual club mapping table, keyed on FBref team IDs rather than names, handles clubs</w:t>
+            </w:r>
             <w:r>
               <w:rPr>
                 <w:b w:val="false"/>
@@ -4058,28 +3652,15 @@
             </w:tcMar>
           </w:tcPr>
           <w:p>
-            <w:del w:id="9052" w:author="Claude" w:date="2026-09-11T21:20:49Z">
-              <w:r>
-                <w:rPr>
-                  <w:b w:val="false"/>
-                  <w:bCs w:val="false"/>
-                  <w:sz w:val="20"/>
-                  <w:szCs w:val="20"/>
-                </w:rPr>
-                <w:delText xml:space="preserve">Scraper fragility</w:delText>
-              </w:r>
-            </w:del>
-            <w:ins w:id="9053" w:author="Claude" w:date="2026-09-11T21:20:49Z">
-              <w:r>
-                <w:rPr>
-                  <w:b w:val="false"/>
-                  <w:bCs w:val="false"/>
-                  <w:sz w:val="20"/>
-                  <w:szCs w:val="20"/>
-                </w:rPr>
-                <w:t xml:space="preserve">FBref access and data availability</w:t>
-              </w:r>
-            </w:ins>
+            <w:r>
+              <w:rPr>
+                <w:b w:val="false"/>
+                <w:bCs w:val="false"/>
+                <w:sz w:val="20"/>
+                <w:szCs w:val="20"/>
+              </w:rPr>
+              <w:t xml:space="preserve">FBref access and data availability</w:t>
+            </w:r>
           </w:p>
         </w:tc>
         <w:tc>
@@ -4093,28 +3674,15 @@
             </w:tcMar>
           </w:tcPr>
           <w:p>
-            <w:del w:id="9048" w:author="Claude" w:date="2026-09-11T21:20:49Z">
-              <w:r>
-                <w:rPr>
-                  <w:b w:val="false"/>
-                  <w:bCs w:val="false"/>
-                  <w:sz w:val="20"/>
-                  <w:szCs w:val="20"/>
-                </w:rPr>
-                <w:delText xml:space="preserve">FBref rate-limits; a nine-season pull is a multi-hour unattended job</w:delText>
-              </w:r>
-            </w:del>
-            <w:ins w:id="9049" w:author="Claude" w:date="2026-09-11T21:20:49Z">
-              <w:r>
-                <w:rPr>
-                  <w:b w:val="false"/>
-                  <w:bCs w:val="false"/>
-                  <w:sz w:val="20"/>
-                  <w:szCs w:val="20"/>
-                </w:rPr>
-                <w:t xml:space="preserve">Materialised, then superseded. FBref blocks automated clients, and on 20 January 2026 lost its advanced data entirely (4.1)</w:t>
-              </w:r>
-            </w:ins>
+            <w:r>
+              <w:rPr>
+                <w:b w:val="false"/>
+                <w:bCs w:val="false"/>
+                <w:sz w:val="20"/>
+                <w:szCs w:val="20"/>
+              </w:rPr>
+              <w:t xml:space="preserve">Materialised, then superseded. FBref blocks automated clients, and on 20 January 2026 lost its advanced data entirely (4.1)</w:t>
+            </w:r>
           </w:p>
         </w:tc>
         <w:tc>
@@ -4128,28 +3696,15 @@
             </w:tcMar>
           </w:tcPr>
           <w:p>
-            <w:del w:id="9050" w:author="Claude" w:date="2026-09-11T21:20:49Z">
-              <w:r>
-                <w:rPr>
-                  <w:b w:val="false"/>
-                  <w:bCs w:val="false"/>
-                  <w:sz w:val="20"/>
-                  <w:szCs w:val="20"/>
-                </w:rPr>
-                <w:delText xml:space="preserve">Test on one season before the full run. Cache aggressively</w:delText>
-              </w:r>
-            </w:del>
-            <w:ins w:id="9051" w:author="Claude" w:date="2026-09-11T21:20:49Z">
-              <w:r>
-                <w:rPr>
-                  <w:b w:val="false"/>
-                  <w:bCs w:val="false"/>
-                  <w:sz w:val="20"/>
-                  <w:szCs w:val="20"/>
-                </w:rPr>
-                <w:t xml:space="preserve">No live scraping of FBref. The frozen worldfootballR snapshot is archived locally with a checksummed manifest; shot-creating actions come from a Kaggle copy validated against it</w:t>
-              </w:r>
-            </w:ins>
+            <w:r>
+              <w:rPr>
+                <w:b w:val="false"/>
+                <w:bCs w:val="false"/>
+                <w:sz w:val="20"/>
+                <w:szCs w:val="20"/>
+              </w:rPr>
+              <w:t xml:space="preserve">No live scraping of FBref. The frozen worldfootballR snapshot is archived locally with a checksummed manifest; shot-creating actions come from a Kaggle copy validated against it</w:t>
+            </w:r>
           </w:p>
         </w:tc>
       </w:tr>
@@ -4261,28 +3816,15 @@
             </w:tcMar>
           </w:tcPr>
           <w:p>
-            <w:del w:id="9087" w:author="Claude" w:date="2026-09-11T22:04:37Z">
-              <w:r>
-                <w:rPr>
-                  <w:b w:val="false"/>
-                  <w:bCs w:val="false"/>
-                  <w:sz w:val="20"/>
-                  <w:szCs w:val="20"/>
-                </w:rPr>
-                <w:delText xml:space="preserve">Inconsistently recorded on Transfermarkt</w:delText>
-              </w:r>
-            </w:del>
-            <w:ins w:id="9088" w:author="Claude" w:date="2026-09-11T22:04:37Z">
-              <w:r>
-                <w:rPr>
-                  <w:b w:val="false"/>
-                  <w:bCs w:val="false"/>
-                  <w:sz w:val="20"/>
-                  <w:szCs w:val="20"/>
-                </w:rPr>
-                <w:t xml:space="preserve">Verified: the Transfermarkt source records loans, loan returns and free transfers alike as a zero fee, and discards loan fees</w:t>
-              </w:r>
-            </w:ins>
+            <w:r>
+              <w:rPr>
+                <w:b w:val="false"/>
+                <w:bCs w:val="false"/>
+                <w:sz w:val="20"/>
+                <w:szCs w:val="20"/>
+              </w:rPr>
+              <w:t xml:space="preserve">Verified: the Transfermarkt source records loans, loan returns and free transfers alike as a zero fee, and discards loan fees</w:t>
+            </w:r>
           </w:p>
         </w:tc>
         <w:tc>
@@ -4296,28 +3838,15 @@
             </w:tcMar>
           </w:tcPr>
           <w:p>
-            <w:del w:id="9089" w:author="Claude" w:date="2026-09-11T22:04:37Z">
-              <w:r>
-                <w:rPr>
-                  <w:b w:val="false"/>
-                  <w:bCs w:val="false"/>
-                  <w:sz w:val="20"/>
-                  <w:szCs w:val="20"/>
-                </w:rPr>
-                <w:delText xml:space="preserve">Verify availability before building dependent visuals</w:delText>
-              </w:r>
-            </w:del>
-            <w:ins w:id="9090" w:author="Claude" w:date="2026-09-11T22:04:37Z">
-              <w:r>
-                <w:rPr>
-                  <w:b w:val="false"/>
-                  <w:bCs w:val="false"/>
-                  <w:sz w:val="20"/>
-                  <w:szCs w:val="20"/>
-                </w:rPr>
-                <w:t xml:space="preserve">Accepted and documented in the coverage map: spending is split into permanent transfers vs free transfers and loans; loan fees aren't counted; revisited if loan-heavy clubs look mis-scored</w:t>
-              </w:r>
-            </w:ins>
+            <w:r>
+              <w:rPr>
+                <w:b w:val="false"/>
+                <w:bCs w:val="false"/>
+                <w:sz w:val="20"/>
+                <w:szCs w:val="20"/>
+              </w:rPr>
+              <w:t xml:space="preserve">Accepted and documented in the coverage map: spending is split into permanent transfers vs free transfers and loans; loan fees aren't counted; revisited if loan-heavy clubs look mis-scored</w:t>
+            </w:r>
           </w:p>
         </w:tc>
       </w:tr>
@@ -4701,24 +4230,13 @@
         </w:rPr>
         <w:t xml:space="preserve">Lets a reader inspect any single club. Squad with market values and nationality, the club's efficiency score broken into its four component pillars, </w:t>
       </w:r>
-      <w:del w:id="9083" w:author="Claude" w:date="2026-09-11T22:04:37Z">
-        <w:r>
-          <w:rPr>
-            <w:sz w:val="22"/>
-            <w:szCs w:val="22"/>
-          </w:rPr>
-          <w:delText xml:space="preserve">a spending breakdown split by permanent, loan and free transfers</w:delText>
-        </w:r>
-      </w:del>
-      <w:ins w:id="9084" w:author="Claude" w:date="2026-09-11T22:04:37Z">
-        <w:r>
-          <w:rPr>
-            <w:sz w:val="22"/>
-            <w:szCs w:val="22"/>
-          </w:rPr>
-          <w:t xml:space="preserve">a spending breakdown split into permanent transfers and free transfers or loans combined (loan fees can't be recovered; see section 7)</w:t>
-        </w:r>
-      </w:ins>
+      <w:r>
+        <w:rPr>
+          <w:sz w:val="22"/>
+          <w:szCs w:val="22"/>
+        </w:rPr>
+        <w:t xml:space="preserve">a spending breakdown split into permanent transfers and free transfers or loans combined (loan fees can't be recovered; see section 7)</w:t>
+      </w:r>
       <w:r>
         <w:rPr>
           <w:sz w:val="22"/>
@@ -4726,24 +4244,13 @@
         </w:rPr>
         <w:t xml:space="preserve">, largest transfers with </w:t>
       </w:r>
-      <w:del w:id="9085" w:author="Claude" w:date="2026-09-11T22:04:37Z">
-        <w:r>
-          <w:rPr>
-            <w:sz w:val="22"/>
-            <w:szCs w:val="22"/>
-          </w:rPr>
-          <w:delText xml:space="preserve">a bought / sold / loan filter</w:delText>
-        </w:r>
-      </w:del>
-      <w:ins w:id="9086" w:author="Claude" w:date="2026-09-11T22:04:37Z">
-        <w:r>
-          <w:rPr>
-            <w:sz w:val="22"/>
-            <w:szCs w:val="22"/>
-          </w:rPr>
-          <w:t xml:space="preserve">a bought / sold filter</w:t>
-        </w:r>
-      </w:ins>
+      <w:r>
+        <w:rPr>
+          <w:sz w:val="22"/>
+          <w:szCs w:val="22"/>
+        </w:rPr>
+        <w:t xml:space="preserve">a bought / sold filter</w:t>
+      </w:r>
       <w:r>
         <w:rPr>
           <w:sz w:val="22"/>

</xml_diff>

<commit_message>
Accept the 12 September tracked changes in the scoping doc
Four insertions and four deletions, all decided at the time: the loan-fee
resolution in the section 7 risk table, and the two page-2 dashboard lines
(three-way spending breakdown, bought/sold/loan filter).

The six section 5 changes dated 16 September stay pending for review in Word.

Co-Authored-By: Claude Opus 5 <noreply@anthropic.com>
</commit_message>
<xml_diff>
--- a/docs/Transfer-Market-Efficiency-Scoping-Doc.docx
+++ b/docs/Transfer-Market-Efficiency-Scoping-Doc.docx
@@ -3959,28 +3959,15 @@
             </w:tcMar>
           </w:tcPr>
           <w:p>
-            <w:del w:id="1" w:author="Claude" w:date="2026-09-12T23:41:48Z">
-              <w:r>
-                <w:rPr>
-                  <w:b w:val="false"/>
-                  <w:bCs w:val="false"/>
-                  <w:sz w:val="20"/>
-                  <w:szCs w:val="20"/>
-                </w:rPr>
-                <w:delText xml:space="preserve">Verified: the Transfermarkt source records loans, loan returns and free transfers alike as a zero fee, and discards loan fees</w:delText>
-              </w:r>
-            </w:del>
-            <w:ins w:id="2" w:author="Claude" w:date="2026-09-12T23:41:48Z">
-              <w:r>
-                <w:rPr>
-                  <w:b w:val="false"/>
-                  <w:bCs w:val="false"/>
-                  <w:sz w:val="20"/>
-                  <w:szCs w:val="20"/>
-                </w:rPr>
-                <w:t xml:space="preserve">Resolved. The Transfermarkt build first used records loans, loan returns and free transfers alike as a zero fee and discards loan fees; fees were therefore pulled directly from Transfermarkt's club transfer pages instead, which label every row</w:t>
-              </w:r>
-            </w:ins>
+            <w:r>
+              <w:rPr>
+                <w:b w:val="false"/>
+                <w:bCs w:val="false"/>
+                <w:sz w:val="20"/>
+                <w:szCs w:val="20"/>
+              </w:rPr>
+              <w:t xml:space="preserve">Resolved. The Transfermarkt build first used records loans, loan returns and free transfers alike as a zero fee and discards loan fees; fees were therefore pulled directly from Transfermarkt's club transfer pages instead, which label every row</w:t>
+            </w:r>
           </w:p>
         </w:tc>
         <w:tc>
@@ -3994,28 +3981,15 @@
             </w:tcMar>
           </w:tcPr>
           <w:p>
-            <w:del w:id="3" w:author="Claude" w:date="2026-09-12T23:41:48Z">
-              <w:r>
-                <w:rPr>
-                  <w:b w:val="false"/>
-                  <w:bCs w:val="false"/>
-                  <w:sz w:val="20"/>
-                  <w:szCs w:val="20"/>
-                </w:rPr>
-                <w:delText xml:space="preserve">Accepted and documented in the coverage map: spending is split into permanent transfers vs free transfers and loans; loan fees aren't counted; revisited if loan-heavy clubs look mis-scored</w:delText>
-              </w:r>
-            </w:del>
-            <w:ins w:id="4" w:author="Claude" w:date="2026-09-12T23:41:48Z">
-              <w:r>
-                <w:rPr>
-                  <w:b w:val="false"/>
-                  <w:bCs w:val="false"/>
-                  <w:sz w:val="20"/>
-                  <w:szCs w:val="20"/>
-                </w:rPr>
-                <w:t xml:space="preserve">Loan fees are recovered (EUR 2,189m across 1,617 loans, 14.4% of all loans) and every row carries its own label, so spending splits three ways again: permanent, loan and free. The revisit criterion set when this was accepted has been satisfied rather than left open</w:t>
-              </w:r>
-            </w:ins>
+            <w:r>
+              <w:rPr>
+                <w:b w:val="false"/>
+                <w:bCs w:val="false"/>
+                <w:sz w:val="20"/>
+                <w:szCs w:val="20"/>
+              </w:rPr>
+              <w:t xml:space="preserve">Loan fees are recovered (EUR 2,189m across 1,617 loans, 14.4% of all loans) and every row carries its own label, so spending splits three ways again: permanent, loan and free. The revisit criterion set when this was accepted has been satisfied rather than left open</w:t>
+            </w:r>
           </w:p>
         </w:tc>
       </w:tr>
@@ -4399,24 +4373,13 @@
         </w:rPr>
         <w:t xml:space="preserve">Lets a reader inspect any single club. Squad with market values and nationality, the club's efficiency score broken into its four component pillars, </w:t>
       </w:r>
-      <w:del w:id="5" w:author="Claude" w:date="2026-09-12T23:41:48Z">
-        <w:r>
-          <w:rPr>
-            <w:sz w:val="22"/>
-            <w:szCs w:val="22"/>
-          </w:rPr>
-          <w:delText xml:space="preserve">a spending breakdown split into permanent transfers and free transfers or loans combined (loan fees can't be recovered; see section 7)</w:delText>
-        </w:r>
-      </w:del>
-      <w:ins w:id="6" w:author="Claude" w:date="2026-09-12T23:41:48Z">
-        <w:r>
-          <w:rPr>
-            <w:sz w:val="22"/>
-            <w:szCs w:val="22"/>
-          </w:rPr>
-          <w:t xml:space="preserve">a spending breakdown split by permanent, loan and free transfers</w:t>
-        </w:r>
-      </w:ins>
+      <w:r>
+        <w:rPr>
+          <w:sz w:val="22"/>
+          <w:szCs w:val="22"/>
+        </w:rPr>
+        <w:t xml:space="preserve">a spending breakdown split by permanent, loan and free transfers</w:t>
+      </w:r>
       <w:r>
         <w:rPr>
           <w:sz w:val="22"/>
@@ -4424,24 +4387,13 @@
         </w:rPr>
         <w:t xml:space="preserve">, largest transfers with </w:t>
       </w:r>
-      <w:del w:id="7" w:author="Claude" w:date="2026-09-12T23:41:48Z">
-        <w:r>
-          <w:rPr>
-            <w:sz w:val="22"/>
-            <w:szCs w:val="22"/>
-          </w:rPr>
-          <w:delText xml:space="preserve">a bought / sold filter</w:delText>
-        </w:r>
-      </w:del>
-      <w:ins w:id="8" w:author="Claude" w:date="2026-09-12T23:41:48Z">
-        <w:r>
-          <w:rPr>
-            <w:sz w:val="22"/>
-            <w:szCs w:val="22"/>
-          </w:rPr>
-          <w:t xml:space="preserve">a bought / sold / loan filter</w:t>
-        </w:r>
-      </w:ins>
+      <w:r>
+        <w:rPr>
+          <w:sz w:val="22"/>
+          <w:szCs w:val="22"/>
+        </w:rPr>
+        <w:t xml:space="preserve">a bought / sold / loan filter</w:t>
+      </w:r>
       <w:r>
         <w:rPr>
           <w:sz w:val="22"/>

</xml_diff>

<commit_message>
Accept the section 5 rewrite and the section 7 loan-fee fix
Reviewed and approved in Word (Tyler, 2026-09-16):

- Section 5 now says the weights are chosen and documents why: the
  derived-weights method was built and measured first, and failed on wrong
  signs, near-zero explanatory power and unstable coefficients, all structural
  because the pillars are normalised against squad value while points correlate
  0.67 with it. It keeps the finding that selling well costs points.
- Section 7's loan-fee sentence is no longer garbled.

The document now carries no pending tracked changes. Also ignore Word's ~$ lock
files.

Co-Authored-By: Claude Opus 5 <noreply@anthropic.com>
</commit_message>
<xml_diff>
--- a/docs/Transfer-Market-Efficiency-Scoping-Doc.docx
+++ b/docs/Transfer-Market-Efficiency-Scoping-Doc.docx
@@ -2703,193 +2703,135 @@
       <w:pPr>
         <w:spacing w:after="140"/>
       </w:pPr>
-      <w:del w:id="9001" w:author="Claude" w:date="2026-09-16T00:00:00Z">
-        <w:r>
-          <w:rPr>
-            <w:b/>
-            <w:bCs/>
-            <w:i w:val="false"/>
-            <w:iCs w:val="false"/>
-            <w:sz w:val="22"/>
-            <w:szCs w:val="22"/>
-          </w:rPr>
-          <w:delText xml:space="preserve">The weights are derived, not chosen. </w:delText>
-        </w:r>
-        <w:r>
-          <w:rPr>
-            <w:b w:val="false"/>
-            <w:bCs w:val="false"/>
-            <w:i w:val="false"/>
-            <w:iCs w:val="false"/>
-            <w:sz w:val="22"/>
-            <w:szCs w:val="22"/>
-          </w:rPr>
-          <w:delText xml:space="preserve">Rather than assigning weights by judgment, each pillar is regressed against actual sporting success </w:delText>
-        </w:r>
-        <w:r>
-          <w:rPr>
-            <w:b w:val="false"/>
-            <w:bCs w:val="false"/>
-            <w:i w:val="false"/>
-            <w:iCs w:val="false"/>
-            <w:sz w:val="22"/>
-            <w:szCs w:val="22"/>
-          </w:rPr>
-          <w:delText xml:space="preserve">across the seven seasons</w:delText>
-        </w:r>
-        <w:r>
-          <w:rPr>
-            <w:b w:val="false"/>
-            <w:bCs w:val="false"/>
-            <w:i w:val="false"/>
-            <w:iCs w:val="false"/>
-            <w:sz w:val="22"/>
-            <w:szCs w:val="22"/>
-          </w:rPr>
-          <w:delText xml:space="preserve">, and the coefficients set the weights. The model is answerable to the data rather than to the analyst's priors.</w:delText>
-        </w:r>
-      </w:del>
-    </w:p>
-    <w:p>
-      <w:pPr>
-        <w:spacing w:after="140"/>
-      </w:pPr>
-      <w:ins w:id="9002" w:author="Claude" w:date="2026-09-16T00:00:00Z">
-        <w:r>
-          <w:rPr>
-            <w:b/>
-            <w:bCs/>
-            <w:i w:val="false"/>
-            <w:iCs w:val="false"/>
-            <w:sz w:val="22"/>
-            <w:szCs w:val="22"/>
-          </w:rPr>
-          <w:t xml:space="preserve">The weights are chosen, and the reasoning is documented. </w:t>
-        </w:r>
-        <w:r>
-          <w:rPr>
-            <w:b w:val="false"/>
-            <w:bCs w:val="false"/>
-            <w:i w:val="false"/>
-            <w:iCs w:val="false"/>
-            <w:sz w:val="22"/>
-            <w:szCs w:val="22"/>
-          </w:rPr>
-          <w:t xml:space="preserve">An earlier draft of this section said the weights would be derived by regressing each pillar against sporting success, so that the model answered to the data rather than to the analyst's priors. Built and measured, that method does not survive contact with this data, for three reasons that are structural rather than fixable.</w:t>
-        </w:r>
-      </w:ins>
-    </w:p>
-    <w:p>
-      <w:pPr>
-        <w:spacing w:after="140"/>
-      </w:pPr>
-      <w:ins w:id="9003" w:author="Claude" w:date="2026-09-16T00:00:00Z">
-        <w:r>
-          <w:rPr>
-            <w:b w:val="false"/>
-            <w:bCs w:val="false"/>
-            <w:i w:val="false"/>
-            <w:iCs w:val="false"/>
-            <w:sz w:val="22"/>
-            <w:szCs w:val="22"/>
-          </w:rPr>
-          <w:t xml:space="preserve">First, the signs come out wrong: trading profit takes a negative coefficient against every success target, and at club level so does recruitment ROI (−0.198 against points, −0.167 against trophies). Derived weights would subtract good recruitment and good trading from an efficiency index. Second, there is almost no signal to derive from: the regressions explain between 0.6% and 12.9% of the variance. Third, the coefficients are unstable, moving as much as their own size when a single season is left out.</w:t>
-        </w:r>
-      </w:ins>
-    </w:p>
-    <w:p>
-      <w:pPr>
-        <w:spacing w:after="140"/>
-      </w:pPr>
-      <w:ins w:id="9004" w:author="Claude" w:date="2026-09-16T00:00:00Z">
-        <w:r>
-          <w:rPr>
-            <w:b w:val="false"/>
-            <w:bCs w:val="false"/>
-            <w:i w:val="false"/>
-            <w:iCs w:val="false"/>
-            <w:sz w:val="22"/>
-            <w:szCs w:val="22"/>
-          </w:rPr>
-          <w:t xml:space="preserve">The cause is built into the design. Every pillar is normalised against squad value, so each one measures performance relative to club size, while league points correlate 0.67 with squad value. Efficiency and success are therefore partly opposed, and no regression of one on the other yields sensible weights. Clipping the negative coefficients to zero would force the signs the analyst expected and collapse the index onto a single pillar, which is the opposite of answering to the data.</w:t>
-        </w:r>
-      </w:ins>
-    </w:p>
-    <w:p>
-      <w:pPr>
-        <w:spacing w:after="140"/>
-      </w:pPr>
-      <w:ins w:id="9005" w:author="Claude" w:date="2026-09-16T00:00:00Z">
-        <w:r>
-          <w:rPr>
-            <w:b/>
-            <w:bCs/>
-            <w:i w:val="false"/>
-            <w:iCs w:val="false"/>
-            <w:sz w:val="22"/>
-            <w:szCs w:val="22"/>
-          </w:rPr>
-          <w:t xml:space="preserve">Approach: </w:t>
-        </w:r>
-        <w:r>
-          <w:rPr>
-            <w:b w:val="false"/>
-            <w:bCs w:val="false"/>
-            <w:i w:val="false"/>
-            <w:iCs w:val="false"/>
-            <w:sz w:val="22"/>
-            <w:szCs w:val="22"/>
-          </w:rPr>
-          <w:t xml:space="preserve">the three money pillars — recruitment ROI, trading profit and squad value growth — carry equal weight of 0.30 each. They are near independent (correlations of 0.20 or less) and each is already standardised, so nothing in the evidence ranks one above another. Sporting return carries 0.10: a deliberate guard rail serving the purpose this section gives it, stopping “efficient” from meaning cheap and bad. At that weight the ranking still correlates 0.96 with a money-only index while the average league-points z-score of the top ten rises from +0.23 to +0.72; at 0.25 and above the index turns into a quality ranking instead. The weights are stored in the warehouse alongside their rationale.</w:t>
-        </w:r>
-      </w:ins>
-    </w:p>
-    <w:p>
-      <w:pPr>
-        <w:spacing w:after="140"/>
-      </w:pPr>
-      <w:ins w:id="9006" w:author="Claude" w:date="2026-09-16T00:00:00Z">
-        <w:r>
-          <w:rPr>
-            <w:b w:val="false"/>
-            <w:bCs w:val="false"/>
-            <w:i w:val="false"/>
-            <w:iCs w:val="false"/>
-            <w:sz w:val="22"/>
-            <w:szCs w:val="22"/>
-          </w:rPr>
-          <w:t xml:space="preserve">This section is the project's own standard applied to itself: an interesting wrong answer that is honestly documented is worth more than a clean answer that quietly hides its assumptions. The evidence, including the regression tables, is in docs/phase-3-scoring.md.</w:t>
-        </w:r>
-      </w:ins>
-    </w:p>
-    <w:p>
-      <w:pPr>
-        <w:spacing w:after="140"/>
-      </w:pPr>
-      <w:ins w:id="9007" w:author="Claude" w:date="2026-09-16T00:00:00Z">
-        <w:r>
-          <w:rPr>
-            <w:b/>
-            <w:bCs/>
-            <w:i w:val="false"/>
-            <w:iCs w:val="false"/>
-            <w:sz w:val="22"/>
-            <w:szCs w:val="22"/>
-          </w:rPr>
-          <w:t xml:space="preserve">A finding from the attempt. </w:t>
-        </w:r>
-        <w:r>
-          <w:rPr>
-            <w:b w:val="false"/>
-            <w:bCs w:val="false"/>
-            <w:i w:val="false"/>
-            <w:iCs w:val="false"/>
-            <w:sz w:val="22"/>
-            <w:szCs w:val="22"/>
-          </w:rPr>
-          <w:t xml:space="preserve">Trading profit's negative coefficient against every success measure is worth keeping as a result in its own right: selling your best players at a profit is nearly the same act as weakening your squad in the short term. The clubs that realise the most value — Lille, Leipzig, Atalanta, Brighton, Dortmund — are doing something that shows up as money now and often as fewer points. That tension is why the index keeps four pillars rather than collapsing into one.</w:t>
-        </w:r>
-      </w:ins>
+    </w:p>
+    <w:p>
+      <w:pPr>
+        <w:spacing w:after="140"/>
+      </w:pPr>
+      <w:r>
+        <w:rPr>
+          <w:b/>
+          <w:bCs/>
+          <w:i w:val="false"/>
+          <w:iCs w:val="false"/>
+          <w:sz w:val="22"/>
+          <w:szCs w:val="22"/>
+        </w:rPr>
+        <w:t xml:space="preserve">The weights are chosen, and the reasoning is documented. </w:t>
+      </w:r>
+      <w:r>
+        <w:rPr>
+          <w:b w:val="false"/>
+          <w:bCs w:val="false"/>
+          <w:i w:val="false"/>
+          <w:iCs w:val="false"/>
+          <w:sz w:val="22"/>
+          <w:szCs w:val="22"/>
+        </w:rPr>
+        <w:t xml:space="preserve">An earlier draft of this section said the weights would be derived by regressing each pillar against sporting success, so that the model answered to the data rather than to the analyst's priors. Built and measured, that method does not survive contact with this data, for three reasons that are structural rather than fixable.</w:t>
+      </w:r>
+    </w:p>
+    <w:p>
+      <w:pPr>
+        <w:spacing w:after="140"/>
+      </w:pPr>
+      <w:r>
+        <w:rPr>
+          <w:b w:val="false"/>
+          <w:bCs w:val="false"/>
+          <w:i w:val="false"/>
+          <w:iCs w:val="false"/>
+          <w:sz w:val="22"/>
+          <w:szCs w:val="22"/>
+        </w:rPr>
+        <w:t xml:space="preserve">First, the signs come out wrong: trading profit takes a negative coefficient against every success target, and at club level so does recruitment ROI (−0.198 against points, −0.167 against trophies). Derived weights would subtract good recruitment and good trading from an efficiency index. Second, there is almost no signal to derive from: the regressions explain between 0.6% and 12.9% of the variance. Third, the coefficients are unstable, moving as much as their own size when a single season is left out.</w:t>
+      </w:r>
+    </w:p>
+    <w:p>
+      <w:pPr>
+        <w:spacing w:after="140"/>
+      </w:pPr>
+      <w:r>
+        <w:rPr>
+          <w:b w:val="false"/>
+          <w:bCs w:val="false"/>
+          <w:i w:val="false"/>
+          <w:iCs w:val="false"/>
+          <w:sz w:val="22"/>
+          <w:szCs w:val="22"/>
+        </w:rPr>
+        <w:t xml:space="preserve">The cause is built into the design. Every pillar is normalised against squad value, so each one measures performance relative to club size, while league points correlate 0.67 with squad value. Efficiency and success are therefore partly opposed, and no regression of one on the other yields sensible weights. Clipping the negative coefficients to zero would force the signs the analyst expected and collapse the index onto a single pillar, which is the opposite of answering to the data.</w:t>
+      </w:r>
+    </w:p>
+    <w:p>
+      <w:pPr>
+        <w:spacing w:after="140"/>
+      </w:pPr>
+      <w:r>
+        <w:rPr>
+          <w:b/>
+          <w:bCs/>
+          <w:i w:val="false"/>
+          <w:iCs w:val="false"/>
+          <w:sz w:val="22"/>
+          <w:szCs w:val="22"/>
+        </w:rPr>
+        <w:t xml:space="preserve">Approach: </w:t>
+      </w:r>
+      <w:r>
+        <w:rPr>
+          <w:b w:val="false"/>
+          <w:bCs w:val="false"/>
+          <w:i w:val="false"/>
+          <w:iCs w:val="false"/>
+          <w:sz w:val="22"/>
+          <w:szCs w:val="22"/>
+        </w:rPr>
+        <w:t xml:space="preserve">the three money pillars — recruitment ROI, trading profit and squad value growth — carry equal weight of 0.30 each. They are near independent (correlations of 0.20 or less) and each is already standardised, so nothing in the evidence ranks one above another. Sporting return carries 0.10: a deliberate guard rail serving the purpose this section gives it, stopping “efficient” from meaning cheap and bad. At that weight the ranking still correlates 0.96 with a money-only index while the average league-points z-score of the top ten rises from +0.23 to +0.72; at 0.25 and above the index turns into a quality ranking instead. The weights are stored in the warehouse alongside their rationale.</w:t>
+      </w:r>
+    </w:p>
+    <w:p>
+      <w:pPr>
+        <w:spacing w:after="140"/>
+      </w:pPr>
+      <w:r>
+        <w:rPr>
+          <w:b w:val="false"/>
+          <w:bCs w:val="false"/>
+          <w:i w:val="false"/>
+          <w:iCs w:val="false"/>
+          <w:sz w:val="22"/>
+          <w:szCs w:val="22"/>
+        </w:rPr>
+        <w:t xml:space="preserve">This section is the project's own standard applied to itself: an interesting wrong answer that is honestly documented is worth more than a clean answer that quietly hides its assumptions. The evidence, including the regression tables, is in docs/phase-3-scoring.md.</w:t>
+      </w:r>
+    </w:p>
+    <w:p>
+      <w:pPr>
+        <w:spacing w:after="140"/>
+      </w:pPr>
+      <w:r>
+        <w:rPr>
+          <w:b/>
+          <w:bCs/>
+          <w:i w:val="false"/>
+          <w:iCs w:val="false"/>
+          <w:sz w:val="22"/>
+          <w:szCs w:val="22"/>
+        </w:rPr>
+        <w:t xml:space="preserve">A finding from the attempt. </w:t>
+      </w:r>
+      <w:r>
+        <w:rPr>
+          <w:b w:val="false"/>
+          <w:bCs w:val="false"/>
+          <w:i w:val="false"/>
+          <w:iCs w:val="false"/>
+          <w:sz w:val="22"/>
+          <w:szCs w:val="22"/>
+        </w:rPr>
+        <w:t xml:space="preserve">Trading profit's negative coefficient against every success measure is worth keeping as a result in its own right: selling your best players at a profit is nearly the same act as weakening your squad in the short term. The clubs that realise the most value — Lille, Leipzig, Atalanta, Brighton, Dortmund — are doing something that shows up as money now and often as fewer points. That tension is why the index keeps four pillars rather than collapsing into one.</w:t>
+      </w:r>
     </w:p>
     <w:p>
       <w:pPr>
@@ -3966,7 +3908,25 @@
                 <w:sz w:val="20"/>
                 <w:szCs w:val="20"/>
               </w:rPr>
-              <w:t xml:space="preserve">Resolved. The Transfermarkt build first used records loans, loan returns and free transfers alike as a zero fee and discards loan fees; fees were therefore pulled directly from Transfermarkt's club transfer pages instead, which label every row</w:t>
+              <w:t xml:space="preserve">Resolved. The Transfermarkt build </w:t>
+            </w:r>
+            <w:r>
+              <w:rPr>
+                <w:b w:val="false"/>
+                <w:bCs w:val="false"/>
+                <w:sz w:val="20"/>
+                <w:szCs w:val="20"/>
+              </w:rPr>
+              <w:t xml:space="preserve">we first used records loans, loan returns and free transfers alike as a zero fee, and discards loan fees;</w:t>
+            </w:r>
+            <w:r>
+              <w:rPr>
+                <w:b w:val="false"/>
+                <w:bCs w:val="false"/>
+                <w:sz w:val="20"/>
+                <w:szCs w:val="20"/>
+              </w:rPr>
+              <w:t xml:space="preserve"> fees were therefore pulled directly from Transfermarkt's club transfer pages instead, which label every row</w:t>
             </w:r>
           </w:p>
         </w:tc>

</xml_diff>

<commit_message>
Amend scoping doc 4.8: the recency layer was deferred, not built
Tracked changes, so they can be reviewed in Word:
- the section 3 scope table, the 4.8 heading and its opening sentence no longer
  say later transfer windows are shown;
- 4.8's approach paragraph is labelled as the planned approach;
- a short status paragraph: deferred for the first release because the
  club-page pull covered the scored window only, so the dashboard shows
  2017/18 to 2023/24; revisit by running the same plain-HTTP pull for
  2024/25 to 2026/27 when there is time.

Co-Authored-By: Claude Opus 5 <noreply@anthropic.com>
</commit_message>
<xml_diff>
--- a/docs/Transfer-Market-Efficiency-Scoping-Doc.docx
+++ b/docs/Transfer-Market-Efficiency-Scoping-Doc.docx
@@ -971,7 +971,38 @@
                 <w:sz w:val="20"/>
                 <w:szCs w:val="20"/>
               </w:rPr>
-              <w:t xml:space="preserve">On-field output after 2023/24, which can no longer be measured on the same basis (4.1). Later transfer windows, including 2026/27, are shown but not scored (4.8)</w:t>
+              <w:t xml:space="preserve">On-field output after 2023/24, which can no longer be measured on the same basis (4.1). Later transfer windows, including 2026/27, </w:t>
+            </w:r>
+            <w:del w:id="9301" w:author="Claude" w:date="2026-09-16T18:00:00Z">
+              <w:r>
+                <w:rPr>
+                  <w:b w:val="false"/>
+                  <w:bCs w:val="false"/>
+                  <w:sz w:val="20"/>
+                  <w:szCs w:val="20"/>
+                </w:rPr>
+                <w:delText xml:space="preserve">are shown but not scored</w:delText>
+              </w:r>
+            </w:del>
+            <w:ins w:id="9302" w:author="Claude" w:date="2026-09-16T18:00:00Z">
+              <w:r>
+                <w:rPr>
+                  <w:b w:val="false"/>
+                  <w:bCs w:val="false"/>
+                  <w:sz w:val="20"/>
+                  <w:szCs w:val="20"/>
+                </w:rPr>
+                <w:t xml:space="preserve">are not scored, and not yet shown</w:t>
+              </w:r>
+            </w:ins>
+            <w:r>
+              <w:rPr>
+                <w:b w:val="false"/>
+                <w:bCs w:val="false"/>
+                <w:sz w:val="20"/>
+                <w:szCs w:val="20"/>
+              </w:rPr>
+              <w:t xml:space="preserve"> (4.8)</w:t>
             </w:r>
           </w:p>
         </w:tc>
@@ -2103,20 +2134,52 @@
       <w:r>
         <w:t xml:space="preserve">transfers after 2023/24 are</w:t>
       </w:r>
-      <w:r>
-        <w:t xml:space="preserve"> shown but not scored</w:t>
-      </w:r>
-    </w:p>
-    <w:p>
-      <w:pPr>
-        <w:spacing w:after="140"/>
-      </w:pPr>
-      <w:r>
-        <w:rPr>
-          <w:sz w:val="22"/>
-          <w:szCs w:val="22"/>
-        </w:rPr>
-        <w:t xml:space="preserve">Three seasons of transfer activity fall after the scored window: 2024/25, 2025/26 and 2026/27. All three appear on the club page and none is scored, for two different reasons.</w:t>
+      <w:del w:id="9303" w:author="Claude" w:date="2026-09-16T18:00:00Z">
+        <w:r>
+          <w:delText xml:space="preserve"> shown but not scored</w:delText>
+        </w:r>
+      </w:del>
+      <w:ins w:id="9304" w:author="Claude" w:date="2026-09-16T18:00:00Z">
+        <w:r>
+          <w:t xml:space="preserve"> not scored, and not yet shown</w:t>
+        </w:r>
+      </w:ins>
+    </w:p>
+    <w:p>
+      <w:pPr>
+        <w:spacing w:after="140"/>
+      </w:pPr>
+      <w:r>
+        <w:rPr>
+          <w:sz w:val="22"/>
+          <w:szCs w:val="22"/>
+        </w:rPr>
+        <w:t xml:space="preserve">Three seasons of transfer activity fall after the scored window: 2024/25, 2025/26 and 2026/27. </w:t>
+      </w:r>
+      <w:del w:id="9305" w:author="Claude" w:date="2026-09-16T18:00:00Z">
+        <w:r>
+          <w:rPr>
+            <w:sz w:val="22"/>
+            <w:szCs w:val="22"/>
+          </w:rPr>
+          <w:delText xml:space="preserve">All three appear on the club page and none is scored</w:delText>
+        </w:r>
+      </w:del>
+      <w:ins w:id="9306" w:author="Claude" w:date="2026-09-16T18:00:00Z">
+        <w:r>
+          <w:rPr>
+            <w:sz w:val="22"/>
+            <w:szCs w:val="22"/>
+          </w:rPr>
+          <w:t xml:space="preserve">None is scored</w:t>
+        </w:r>
+      </w:ins>
+      <w:r>
+        <w:rPr>
+          <w:sz w:val="22"/>
+          <w:szCs w:val="22"/>
+        </w:rPr>
+        <w:t xml:space="preserve">, for two different reasons.</w:t>
       </w:r>
     </w:p>
     <w:p>
@@ -2177,17 +2240,32 @@
       <w:pPr>
         <w:spacing w:after="140"/>
       </w:pPr>
-      <w:r>
-        <w:rPr>
-          <w:b/>
-          <w:bCs/>
-          <w:i w:val="false"/>
-          <w:iCs w:val="false"/>
-          <w:sz w:val="22"/>
-          <w:szCs w:val="22"/>
-        </w:rPr>
-        <w:t xml:space="preserve">Approach: </w:t>
-      </w:r>
+      <w:del w:id="9307" w:author="Claude" w:date="2026-09-16T18:00:00Z">
+        <w:r>
+          <w:rPr>
+            <w:b/>
+            <w:bCs/>
+            <w:i w:val="false"/>
+            <w:iCs w:val="false"/>
+            <w:sz w:val="22"/>
+            <w:szCs w:val="22"/>
+          </w:rPr>
+          <w:delText xml:space="preserve">Approach: </w:delText>
+        </w:r>
+      </w:del>
+      <w:ins w:id="9308" w:author="Claude" w:date="2026-09-16T18:00:00Z">
+        <w:r>
+          <w:rPr>
+            <w:b/>
+            <w:bCs/>
+            <w:i w:val="false"/>
+            <w:iCs w:val="false"/>
+            <w:sz w:val="22"/>
+            <w:szCs w:val="22"/>
+          </w:rPr>
+          <w:t xml:space="preserve">Planned approach: </w:t>
+        </w:r>
+      </w:ins>
       <w:r>
         <w:rPr>
           <w:b w:val="false"/>
@@ -2199,6 +2277,35 @@
         </w:rPr>
         <w:t xml:space="preserve">all three seasons appear on the club page as a recency layer showing what each club spent and received, clearly flagged as unscored, with the reason: output data unavailable for 2024/25 and 2025/26, too early to judge for 2026/27. If comparable advanced data becomes available again (4.1), 2024/25 and 2025/26 are the first candidates to join the scored window, once that data has passed the same overlap test as every other source.</w:t>
       </w:r>
+    </w:p>
+    <w:p>
+      <w:pPr>
+        <w:spacing w:after="140"/>
+      </w:pPr>
+      <w:ins w:id="9309" w:author="Claude" w:date="2026-09-16T18:00:00Z">
+        <w:r>
+          <w:rPr>
+            <w:b/>
+            <w:bCs/>
+            <w:i w:val="false"/>
+            <w:iCs w:val="false"/>
+            <w:sz w:val="22"/>
+            <w:szCs w:val="22"/>
+          </w:rPr>
+          <w:t xml:space="preserve">Status: deferred. </w:t>
+        </w:r>
+        <w:r>
+          <w:rPr>
+            <w:b w:val="false"/>
+            <w:bCs w:val="false"/>
+            <w:i w:val="false"/>
+            <w:iCs w:val="false"/>
+            <w:sz w:val="22"/>
+            <w:szCs w:val="22"/>
+          </w:rPr>
+          <w:t xml:space="preserve">The recency layer was not built for the first release. The club-page pull covered the scored window only, so the warehouse holds no transfers after 2023/24, and the dashboard shows 2017/18 to 2023/24. Revisit criterion: build the layer with the same plain-HTTP club-page pull for 2024/25 to 2026/27 whenever there is time.</w:t>
+        </w:r>
+      </w:ins>
     </w:p>
     <w:p>
       <w:pPr>

</xml_diff>

<commit_message>
Accept the section 4.8 recency-layer amendment
Reviewed and approved in Word (Tyler, 2026-09-16). The scoping doc now says
transfers after 2023/24 are not scored and not yet shown, with the deferral
and its revisit criterion stated. No tracked changes remain.

Co-Authored-By: Claude Opus 5 <noreply@anthropic.com>
</commit_message>
<xml_diff>
--- a/docs/Transfer-Market-Efficiency-Scoping-Doc.docx
+++ b/docs/Transfer-Market-Efficiency-Scoping-Doc.docx
@@ -973,28 +973,15 @@
               </w:rPr>
               <w:t xml:space="preserve">On-field output after 2023/24, which can no longer be measured on the same basis (4.1). Later transfer windows, including 2026/27, </w:t>
             </w:r>
-            <w:del w:id="9301" w:author="Claude" w:date="2026-09-16T18:00:00Z">
-              <w:r>
-                <w:rPr>
-                  <w:b w:val="false"/>
-                  <w:bCs w:val="false"/>
-                  <w:sz w:val="20"/>
-                  <w:szCs w:val="20"/>
-                </w:rPr>
-                <w:delText xml:space="preserve">are shown but not scored</w:delText>
-              </w:r>
-            </w:del>
-            <w:ins w:id="9302" w:author="Claude" w:date="2026-09-16T18:00:00Z">
-              <w:r>
-                <w:rPr>
-                  <w:b w:val="false"/>
-                  <w:bCs w:val="false"/>
-                  <w:sz w:val="20"/>
-                  <w:szCs w:val="20"/>
-                </w:rPr>
-                <w:t xml:space="preserve">are not scored, and not yet shown</w:t>
-              </w:r>
-            </w:ins>
+            <w:r>
+              <w:rPr>
+                <w:b w:val="false"/>
+                <w:bCs w:val="false"/>
+                <w:sz w:val="20"/>
+                <w:szCs w:val="20"/>
+              </w:rPr>
+              <w:t xml:space="preserve">are not scored, and not yet shown</w:t>
+            </w:r>
             <w:r>
               <w:rPr>
                 <w:b w:val="false"/>
@@ -2134,16 +2121,9 @@
       <w:r>
         <w:t xml:space="preserve">transfers after 2023/24 are</w:t>
       </w:r>
-      <w:del w:id="9303" w:author="Claude" w:date="2026-09-16T18:00:00Z">
-        <w:r>
-          <w:delText xml:space="preserve"> shown but not scored</w:delText>
-        </w:r>
-      </w:del>
-      <w:ins w:id="9304" w:author="Claude" w:date="2026-09-16T18:00:00Z">
-        <w:r>
-          <w:t xml:space="preserve"> not scored, and not yet shown</w:t>
-        </w:r>
-      </w:ins>
+      <w:r>
+        <w:t xml:space="preserve"> not scored, and not yet shown</w:t>
+      </w:r>
     </w:p>
     <w:p>
       <w:pPr>
@@ -2156,24 +2136,13 @@
         </w:rPr>
         <w:t xml:space="preserve">Three seasons of transfer activity fall after the scored window: 2024/25, 2025/26 and 2026/27. </w:t>
       </w:r>
-      <w:del w:id="9305" w:author="Claude" w:date="2026-09-16T18:00:00Z">
-        <w:r>
-          <w:rPr>
-            <w:sz w:val="22"/>
-            <w:szCs w:val="22"/>
-          </w:rPr>
-          <w:delText xml:space="preserve">All three appear on the club page and none is scored</w:delText>
-        </w:r>
-      </w:del>
-      <w:ins w:id="9306" w:author="Claude" w:date="2026-09-16T18:00:00Z">
-        <w:r>
-          <w:rPr>
-            <w:sz w:val="22"/>
-            <w:szCs w:val="22"/>
-          </w:rPr>
-          <w:t xml:space="preserve">None is scored</w:t>
-        </w:r>
-      </w:ins>
+      <w:r>
+        <w:rPr>
+          <w:sz w:val="22"/>
+          <w:szCs w:val="22"/>
+        </w:rPr>
+        <w:t xml:space="preserve">None is scored</w:t>
+      </w:r>
       <w:r>
         <w:rPr>
           <w:sz w:val="22"/>
@@ -2240,32 +2209,17 @@
       <w:pPr>
         <w:spacing w:after="140"/>
       </w:pPr>
-      <w:del w:id="9307" w:author="Claude" w:date="2026-09-16T18:00:00Z">
-        <w:r>
-          <w:rPr>
-            <w:b/>
-            <w:bCs/>
-            <w:i w:val="false"/>
-            <w:iCs w:val="false"/>
-            <w:sz w:val="22"/>
-            <w:szCs w:val="22"/>
-          </w:rPr>
-          <w:delText xml:space="preserve">Approach: </w:delText>
-        </w:r>
-      </w:del>
-      <w:ins w:id="9308" w:author="Claude" w:date="2026-09-16T18:00:00Z">
-        <w:r>
-          <w:rPr>
-            <w:b/>
-            <w:bCs/>
-            <w:i w:val="false"/>
-            <w:iCs w:val="false"/>
-            <w:sz w:val="22"/>
-            <w:szCs w:val="22"/>
-          </w:rPr>
-          <w:t xml:space="preserve">Planned approach: </w:t>
-        </w:r>
-      </w:ins>
+      <w:r>
+        <w:rPr>
+          <w:b/>
+          <w:bCs/>
+          <w:i w:val="false"/>
+          <w:iCs w:val="false"/>
+          <w:sz w:val="22"/>
+          <w:szCs w:val="22"/>
+        </w:rPr>
+        <w:t xml:space="preserve">Planned approach: </w:t>
+      </w:r>
       <w:r>
         <w:rPr>
           <w:b w:val="false"/>
@@ -2281,34 +2235,29 @@
     <w:p>
       <w:pPr>
         <w:spacing w:after="140"/>
-        <w:rPr>
-          <w:ins w:id="9310" w:author="Claude" w:date="2026-09-16T18:00:00Z"/>
-        </w:rPr>
-      </w:pPr>
-      <w:ins w:id="9309" w:author="Claude" w:date="2026-09-16T18:00:00Z">
-        <w:r>
-          <w:rPr>
-            <w:b/>
-            <w:bCs/>
-            <w:i w:val="false"/>
-            <w:iCs w:val="false"/>
-            <w:sz w:val="22"/>
-            <w:szCs w:val="22"/>
-          </w:rPr>
-          <w:t xml:space="preserve">Status: deferred. </w:t>
-        </w:r>
-        <w:r>
-          <w:rPr>
-            <w:b w:val="false"/>
-            <w:bCs w:val="false"/>
-            <w:i w:val="false"/>
-            <w:iCs w:val="false"/>
-            <w:sz w:val="22"/>
-            <w:szCs w:val="22"/>
-          </w:rPr>
-          <w:t xml:space="preserve">The recency layer was not built for the first release. The club-page pull covered the scored window only, so the warehouse holds no transfers after 2023/24, and the dashboard shows 2017/18 to 2023/24. Revisit criterion: build the layer with the same plain-HTTP club-page pull for 2024/25 to 2026/27 whenever there is time.</w:t>
-        </w:r>
-      </w:ins>
+      </w:pPr>
+      <w:r>
+        <w:rPr>
+          <w:b/>
+          <w:bCs/>
+          <w:i w:val="false"/>
+          <w:iCs w:val="false"/>
+          <w:sz w:val="22"/>
+          <w:szCs w:val="22"/>
+        </w:rPr>
+        <w:t xml:space="preserve">Status: deferred. </w:t>
+      </w:r>
+      <w:r>
+        <w:rPr>
+          <w:b w:val="false"/>
+          <w:bCs w:val="false"/>
+          <w:i w:val="false"/>
+          <w:iCs w:val="false"/>
+          <w:sz w:val="22"/>
+          <w:szCs w:val="22"/>
+        </w:rPr>
+        <w:t xml:space="preserve">The recency layer was not built for the first release. The club-page pull covered the scored window only, so the warehouse holds no transfers after 2023/24, and the dashboard shows 2017/18 to 2023/24. Revisit criterion: build the layer with the same plain-HTTP club-page pull for 2024/25 to 2026/27 whenever there is time.</w:t>
+      </w:r>
     </w:p>
     <w:p>
       <w:pPr>

</xml_diff>